<commit_message>
finalize correlation analysis and plot diagnostics
- Added rolling correlation analysis (time-varying relationships).
- Included scatter plots of ETFs vs S&P 500 with regression analysis.
- Completed section 'g' of the report with commentary on linear relationships.
- Documented correlation spikes during 2020 and 2025 market events.
- Fixed minor typos in the final discussion (XLE analysis).
</commit_message>
<xml_diff>
--- a/Prima_Prova.docx
+++ b/Prima_Prova.docx
@@ -42,7 +42,6 @@
         <w:t>SOMMARIO DEI DATI UTILIZZATI</w:t>
       </w:r>
     </w:p>
-    <w:p/>
     <w:p>
       <w:pPr>
         <w:pStyle w:val="Paragrafoelenco"/>
@@ -60,7 +59,7 @@
           <w:i/>
           <w:iCs/>
         </w:rPr>
-        <w:t>Breve descrizione di ciascun titolo o ETF selezionato e motivazione della scelta</w:t>
+        <w:t>Breve descrizione di ciascun ETF selezionato e motivazione della scelta</w:t>
       </w:r>
     </w:p>
     <w:p>
@@ -68,19 +67,7 @@
         <w:t>Per lo svolgimento del progetto sono stati selezionati 6 ETF settoriali</w:t>
       </w:r>
       <w:r>
-        <w:t>, che</w:t>
-      </w:r>
-      <w:r>
-        <w:t xml:space="preserve"> copr</w:t>
-      </w:r>
-      <w:r>
-        <w:t>a</w:t>
-      </w:r>
-      <w:r>
-        <w:t>no i pilastri dell’economia statunitense</w:t>
-      </w:r>
-      <w:r>
-        <w:t xml:space="preserve">, </w:t>
+        <w:t xml:space="preserve">, che coprano i pilastri dell’economia statunitense, </w:t>
       </w:r>
       <w:r>
         <w:t>dall’indice S&amp;P500, in particolare:</w:t>
@@ -107,19 +94,7 @@
         </w:numPr>
       </w:pPr>
       <w:r>
-        <w:t xml:space="preserve">State Street </w:t>
-      </w:r>
-      <w:r>
-        <w:t xml:space="preserve">Technology </w:t>
-      </w:r>
-      <w:r>
-        <w:t>Select Sector SPDR ETF (XL</w:t>
-      </w:r>
-      <w:r>
-        <w:t>K</w:t>
-      </w:r>
-      <w:r>
-        <w:t>)</w:t>
+        <w:t>State Street Technology Select Sector SPDR ETF (XLK)</w:t>
       </w:r>
     </w:p>
     <w:p>
@@ -131,19 +106,7 @@
         </w:numPr>
       </w:pPr>
       <w:r>
-        <w:t xml:space="preserve">State Street </w:t>
-      </w:r>
-      <w:r>
-        <w:t>Health Care</w:t>
-      </w:r>
-      <w:r>
-        <w:t xml:space="preserve"> Select Sector SPDR ETF (XL</w:t>
-      </w:r>
-      <w:r>
-        <w:t>V</w:t>
-      </w:r>
-      <w:r>
-        <w:t>)</w:t>
+        <w:t>State Street Health Care Select Sector SPDR ETF (XLV)</w:t>
       </w:r>
     </w:p>
     <w:p>
@@ -155,19 +118,7 @@
         </w:numPr>
       </w:pPr>
       <w:r>
-        <w:t xml:space="preserve">State Street </w:t>
-      </w:r>
-      <w:r>
-        <w:t>Energy</w:t>
-      </w:r>
-      <w:r>
-        <w:t xml:space="preserve"> Select Sector SPDR ETF (XL</w:t>
-      </w:r>
-      <w:r>
-        <w:t>E</w:t>
-      </w:r>
-      <w:r>
-        <w:t>)</w:t>
+        <w:t>State Street Energy Select Sector SPDR ETF (XLE)</w:t>
       </w:r>
     </w:p>
     <w:p>
@@ -179,19 +130,7 @@
         </w:numPr>
       </w:pPr>
       <w:r>
-        <w:t xml:space="preserve">State Street </w:t>
-      </w:r>
-      <w:r>
-        <w:t>Industrial</w:t>
-      </w:r>
-      <w:r>
-        <w:t xml:space="preserve"> Select Sector SPDR ETF (XL</w:t>
-      </w:r>
-      <w:r>
-        <w:t>I</w:t>
-      </w:r>
-      <w:r>
-        <w:t>)</w:t>
+        <w:t>State Street Industrial Select Sector SPDR ETF (XLI)</w:t>
       </w:r>
     </w:p>
     <w:p>
@@ -203,24 +142,7 @@
         </w:numPr>
       </w:pPr>
       <w:r>
-        <w:t xml:space="preserve">State Street </w:t>
-      </w:r>
-      <w:r>
-        <w:t xml:space="preserve">Consumer </w:t>
-      </w:r>
-      <w:proofErr w:type="spellStart"/>
-      <w:r>
-        <w:t>Discretionary</w:t>
-      </w:r>
-      <w:proofErr w:type="spellEnd"/>
-      <w:r>
-        <w:t xml:space="preserve"> Select Sector SPDR ETF (XL</w:t>
-      </w:r>
-      <w:r>
-        <w:t>Y</w:t>
-      </w:r>
-      <w:r>
-        <w:t>)</w:t>
+        <w:t>State Street Consumer Discretionary Select Sector SPDR ETF (XLY)</w:t>
       </w:r>
     </w:p>
     <w:p>
@@ -239,13 +161,7 @@
         <w:t>XLK include società informatiche, del software e dei semiconduttori; è</w:t>
       </w:r>
       <w:r>
-        <w:t xml:space="preserve"> il motore della crescita dell'ultimo decennio. La scelta è guidata </w:t>
-      </w:r>
-      <w:r>
-        <w:t>dalla tendenza</w:t>
-      </w:r>
-      <w:r>
-        <w:t xml:space="preserve"> della trasformazione digitale e, più recentemente, dall'esplosione dell'Intelligenza Artificiale. È </w:t>
+        <w:t xml:space="preserve"> il motore della crescita dell'ultimo decennio. La scelta è guidata dalla tendenza della trasformazione digitale e, più recentemente, dall'esplosione dell'Intelligenza Artificiale. È </w:t>
       </w:r>
       <w:r>
         <w:t xml:space="preserve">noto per essere </w:t>
@@ -316,15 +232,7 @@
         <w:t xml:space="preserve"> come</w:t>
       </w:r>
       <w:r>
-        <w:t xml:space="preserve"> il settore meno correlato agli altri, agendo da </w:t>
-      </w:r>
-      <w:proofErr w:type="spellStart"/>
-      <w:r>
-        <w:t>diversificatore</w:t>
-      </w:r>
-      <w:proofErr w:type="spellEnd"/>
-      <w:r>
-        <w:t>.</w:t>
+        <w:t xml:space="preserve"> il settore meno correlato agli altri, agendo da diversificatore.</w:t>
       </w:r>
     </w:p>
     <w:p>
@@ -353,11 +261,9 @@
       <w:r>
         <w:t xml:space="preserve">a selezione di questi </w:t>
       </w:r>
-      <w:proofErr w:type="gramStart"/>
-      <w:r>
-        <w:t>6</w:t>
-      </w:r>
-      <w:proofErr w:type="gramEnd"/>
+      <w:r>
+        <w:t>sei</w:t>
+      </w:r>
       <w:r>
         <w:t xml:space="preserve"> ETF non è casuale, ma mira a rappresentare un portafoglio</w:t>
       </w:r>
@@ -371,27 +277,17 @@
       <w:r>
         <w:t xml:space="preserve">diversificato composto da settori </w:t>
       </w:r>
-      <w:proofErr w:type="spellStart"/>
       <w:r>
         <w:t>g</w:t>
       </w:r>
       <w:r>
-        <w:t>rowth</w:t>
-      </w:r>
-      <w:proofErr w:type="spellEnd"/>
-      <w:r>
-        <w:t xml:space="preserve"> (XLK, XLY), settori </w:t>
-      </w:r>
-      <w:proofErr w:type="spellStart"/>
+        <w:t xml:space="preserve">rowth (XLK, XLY), settori </w:t>
+      </w:r>
       <w:r>
         <w:t>v</w:t>
       </w:r>
       <w:r>
-        <w:t>alue</w:t>
-      </w:r>
-      <w:proofErr w:type="spellEnd"/>
-      <w:r>
-        <w:t xml:space="preserve"> (XLF, XLI) e settori </w:t>
+        <w:t xml:space="preserve">alue (XLF, XLI) e settori </w:t>
       </w:r>
       <w:r>
         <w:t>d</w:t>
@@ -399,6 +295,14 @@
       <w:r>
         <w:t>ifensivi (XLV), con l'aggiunta di un settore legato alle commodity (XLE). Questa composizione permette di analizzare come shock esogeni (pandemia, guerre, inflazione) colpiscono in modo asimmetrico comparti diversi dell'economia, permettendo di testare l'efficacia della diversificazione settoriale.</w:t>
       </w:r>
+    </w:p>
+    <w:p>
+      <w:pPr>
+        <w:rPr>
+          <w:i/>
+          <w:iCs/>
+        </w:rPr>
+      </w:pPr>
     </w:p>
     <w:p>
       <w:pPr>
@@ -433,53 +337,20 @@
       <w:r>
         <w:t xml:space="preserve">Per l'acquisizione delle serie storiche è stata utilizzata la libreria </w:t>
       </w:r>
-      <w:proofErr w:type="spellStart"/>
       <w:r>
         <w:t>yfinance</w:t>
       </w:r>
-      <w:proofErr w:type="spellEnd"/>
       <w:r>
         <w:t>, un'interfaccia Python open-source che sfrutta le API pubbliche di Yahoo! Finance</w:t>
       </w:r>
       <w:r>
-        <w:t xml:space="preserve">, in particolare la funzione </w:t>
-      </w:r>
-      <w:proofErr w:type="spellStart"/>
-      <w:proofErr w:type="gramStart"/>
-      <w:r>
-        <w:t>yf.download</w:t>
-      </w:r>
-      <w:proofErr w:type="spellEnd"/>
-      <w:proofErr w:type="gramEnd"/>
-      <w:r>
-        <w:t>().</w:t>
+        <w:t>, in particolare la funzione yf.download().</w:t>
       </w:r>
       <w:r>
         <w:t xml:space="preserve"> Questa scelta è motivata dalla velocità di accesso ai dati rettificati</w:t>
       </w:r>
       <w:r>
-        <w:t xml:space="preserve"> (parametro </w:t>
-      </w:r>
-      <w:proofErr w:type="spellStart"/>
-      <w:r>
-        <w:t>auto_adjust</w:t>
-      </w:r>
-      <w:proofErr w:type="spellEnd"/>
-      <w:r>
-        <w:t>=True</w:t>
-      </w:r>
-      <w:r>
-        <w:t xml:space="preserve"> della funzione </w:t>
-      </w:r>
-      <w:proofErr w:type="spellStart"/>
-      <w:proofErr w:type="gramStart"/>
-      <w:r>
-        <w:t>yf.download</w:t>
-      </w:r>
-      <w:proofErr w:type="spellEnd"/>
-      <w:proofErr w:type="gramEnd"/>
-      <w:r>
-        <w:t>)</w:t>
+        <w:t xml:space="preserve"> (parametro auto_adjust=True della funzione yf.download)</w:t>
       </w:r>
       <w:r>
         <w:t>, fondamentali per un'analisi che tenga conto di dividendi e frazionamenti azionari</w:t>
@@ -493,31 +364,7 @@
     </w:p>
     <w:p>
       <w:r>
-        <w:t xml:space="preserve">L'utilizzo di </w:t>
-      </w:r>
-      <w:proofErr w:type="spellStart"/>
-      <w:r>
-        <w:t>yfinance</w:t>
-      </w:r>
-      <w:proofErr w:type="spellEnd"/>
-      <w:r>
-        <w:t xml:space="preserve"> integrato con l'ecosistema </w:t>
-      </w:r>
-      <w:proofErr w:type="spellStart"/>
-      <w:r>
-        <w:t>pandas</w:t>
-      </w:r>
-      <w:proofErr w:type="spellEnd"/>
-      <w:r>
-        <w:t xml:space="preserve"> e </w:t>
-      </w:r>
-      <w:proofErr w:type="spellStart"/>
-      <w:r>
-        <w:t>numpy</w:t>
-      </w:r>
-      <w:proofErr w:type="spellEnd"/>
-      <w:r>
-        <w:t xml:space="preserve"> ha permesso di automatizzare la pipeline di acquisizione, garantendo che l'intera analisi sia riproducibile. Questo approccio 'programmatico' elimina gli errori umani tipici dello scaricamento manuale di file CSV e permette di aggiornare l'analisi in tempo reale semplicemente modificando le date di input.</w:t>
+        <w:t>L'utilizzo di yfinance integrato con l'ecosistema pandas e numpy ha permesso di automatizzare la pipeline di acquisizione, garantendo che l'intera analisi sia riproducibile. Questo approccio 'programmatico' elimina gli errori umani tipici dello scaricamento manuale di file CSV e permette di aggiornare l'analisi in tempo reale semplicemente modificando le date di input.</w:t>
       </w:r>
     </w:p>
     <w:p/>
@@ -538,27 +385,12 @@
           <w:i/>
           <w:iCs/>
         </w:rPr>
-        <w:t xml:space="preserve">Funzioni utilizzate per la fusione delle serie in un unico </w:t>
-      </w:r>
-      <w:proofErr w:type="spellStart"/>
-      <w:r>
-        <w:rPr>
-          <w:i/>
-          <w:iCs/>
-        </w:rPr>
-        <w:t>DataFrame</w:t>
-      </w:r>
-      <w:proofErr w:type="spellEnd"/>
-    </w:p>
-    <w:p>
-      <w:r>
-        <w:t xml:space="preserve">Sebbene le serie storiche dei </w:t>
-      </w:r>
-      <w:r>
-        <w:t>sei</w:t>
-      </w:r>
-      <w:r>
-        <w:t xml:space="preserve"> ETF e dell'indice di mercato provengano dalla stessa fonte, la loro integrazione in un unico oggetto di analisi richiede procedure specifiche per garantire la coerenza dei dati (allineamento delle date e gestione dei valori mancanti).</w:t>
+        <w:t>Funzioni utilizzate per la fusione delle serie in un unico DataFrame</w:t>
+      </w:r>
+    </w:p>
+    <w:p>
+      <w:r>
+        <w:t>Sebbene le serie storiche dei sei ETF e dell'indice di mercato provengano dalla stessa fonte, la loro integrazione in un unico oggetto di analisi richiede procedure specifiche per garantire la coerenza dei dati (allineamento delle date e gestione dei valori mancanti).</w:t>
       </w:r>
     </w:p>
     <w:p>
@@ -566,26 +398,14 @@
         <w:t>L</w:t>
       </w:r>
       <w:r>
-        <w:t xml:space="preserve">a funzione </w:t>
-      </w:r>
-      <w:proofErr w:type="spellStart"/>
-      <w:proofErr w:type="gramStart"/>
-      <w:r>
-        <w:t>yf.download</w:t>
-      </w:r>
-      <w:proofErr w:type="spellEnd"/>
-      <w:proofErr w:type="gramEnd"/>
-      <w:r>
-        <w:t xml:space="preserve"> agisce internamente come un'operazione di </w:t>
-      </w:r>
-      <w:proofErr w:type="spellStart"/>
+        <w:t xml:space="preserve">a funzione yf.download agisce internamente come un'operazione di </w:t>
+      </w:r>
       <w:r>
         <w:t>o</w:t>
       </w:r>
       <w:r>
         <w:t>uter</w:t>
       </w:r>
-      <w:proofErr w:type="spellEnd"/>
       <w:r>
         <w:rPr>
           <w:b/>
@@ -603,39 +423,7 @@
         <w:t xml:space="preserve"> </w:t>
       </w:r>
       <w:r>
-        <w:t xml:space="preserve">La funzione crea un unico asse temporale (indice) che include tutte le date in cui almeno uno dei titoli è stato scambiato. Se un titolo non ha dati per una specifica data, </w:t>
-      </w:r>
-      <w:proofErr w:type="spellStart"/>
-      <w:r>
-        <w:t>Pandas</w:t>
-      </w:r>
-      <w:proofErr w:type="spellEnd"/>
-      <w:r>
-        <w:t xml:space="preserve"> inserisce un valore NaN</w:t>
-      </w:r>
-      <w:r>
-        <w:t>.</w:t>
-      </w:r>
-    </w:p>
-    <w:p>
-      <w:r>
-        <w:t xml:space="preserve">Poiché il download massivo genera un </w:t>
-      </w:r>
-      <w:proofErr w:type="spellStart"/>
-      <w:r>
-        <w:t>DataFrame</w:t>
-      </w:r>
-      <w:proofErr w:type="spellEnd"/>
-      <w:r>
-        <w:t xml:space="preserve"> con colonne a due livelli (es. Close, Open, High per ogni ticker), è stata utilizzata la funzione di selezione per fondere i prezzi in un unico </w:t>
-      </w:r>
-      <w:proofErr w:type="spellStart"/>
-      <w:r>
-        <w:t>DataFrame</w:t>
-      </w:r>
-      <w:proofErr w:type="spellEnd"/>
-      <w:r>
-        <w:t xml:space="preserve"> pulito</w:t>
+        <w:t>La funzione crea un unico indice che include tutte le date in cui almeno uno dei titoli è stato scambiato. Se un titolo non ha dati per una specifica data, Pandas inserisce un valore NaN</w:t>
       </w:r>
       <w:r>
         <w:t>.</w:t>
@@ -659,29 +447,12 @@
           <w:i/>
           <w:iCs/>
         </w:rPr>
-        <w:t xml:space="preserve">Presentazione dei dati con un grafico e le prime righe del </w:t>
-      </w:r>
-      <w:proofErr w:type="spellStart"/>
-      <w:r>
-        <w:rPr>
-          <w:i/>
-          <w:iCs/>
-        </w:rPr>
-        <w:t>DataFrame</w:t>
-      </w:r>
-      <w:proofErr w:type="spellEnd"/>
-    </w:p>
-    <w:p>
-      <w:r>
-        <w:t xml:space="preserve">Prime sei righe dei singoli </w:t>
-      </w:r>
-      <w:proofErr w:type="spellStart"/>
-      <w:r>
-        <w:t>DataFrame</w:t>
-      </w:r>
-      <w:proofErr w:type="spellEnd"/>
-      <w:r>
-        <w:t xml:space="preserve"> per ETF </w:t>
+        <w:t>Presentazione dei dati con un grafico e le prime righe del DataFrame</w:t>
+      </w:r>
+    </w:p>
+    <w:p>
+      <w:r>
+        <w:t xml:space="preserve">Prime sei righe dei singoli DataFrame per ETF </w:t>
       </w:r>
       <w:r>
         <w:t>(N.B.</w:t>
@@ -935,12 +706,8 @@
         </w:drawing>
       </w:r>
     </w:p>
-    <w:p/>
-    <w:p/>
-    <w:p/>
-    <w:p>
-      <w:r>
-        <w:lastRenderedPageBreak/>
+    <w:p>
+      <w:r>
         <w:t>XLI:</w:t>
       </w:r>
       <w:r>
@@ -1060,9 +827,9 @@
         </w:drawing>
       </w:r>
     </w:p>
-    <w:p/>
-    <w:p>
-      <w:r>
+    <w:p>
+      <w:r>
+        <w:lastRenderedPageBreak/>
         <w:t>Dall'ispezione visiva dei dati tramite il grafico dell'andamento dei prezzi, si possono trarre le prime considerazioni macroeconomiche:</w:t>
       </w:r>
     </w:p>
@@ -1171,6 +938,12 @@
       </w:pPr>
     </w:p>
     <w:p/>
+    <w:p/>
+    <w:p/>
+    <w:p/>
+    <w:p/>
+    <w:p/>
+    <w:p/>
     <w:p>
       <w:pPr>
         <w:rPr>
@@ -1185,7 +958,6 @@
         <w:t>2.STATISTICHE DESCRITTIVE</w:t>
       </w:r>
     </w:p>
-    <w:p/>
     <w:p>
       <w:pPr>
         <w:pStyle w:val="Paragrafoelenco"/>
@@ -2325,7 +2097,7 @@
             <w:noProof/>
           </w:rPr>
           <w:drawing>
-            <wp:inline distT="0" distB="0" distL="0" distR="0" wp14:anchorId="4A7FC046" wp14:editId="323CC7FB">
+            <wp:inline distT="0" distB="0" distL="0" distR="0" wp14:anchorId="4A7FC046" wp14:editId="3C3BF728">
               <wp:extent cx="3028607" cy="2499750"/>
               <wp:effectExtent l="0" t="0" r="635" b="0"/>
               <wp:docPr id="874040197" name="Immagine 11"/>
@@ -2354,7 +2126,7 @@
                     <pic:spPr>
                       <a:xfrm>
                         <a:off x="0" y="0"/>
-                        <a:ext cx="3032883" cy="2503280"/>
+                        <a:ext cx="3028607" cy="2499750"/>
                       </a:xfrm>
                       <a:prstGeom prst="rect">
                         <a:avLst/>
@@ -2416,6 +2188,14 @@
     </w:p>
     <w:p>
       <w:pPr>
+        <w:rPr>
+          <w:i/>
+          <w:iCs/>
+        </w:rPr>
+      </w:pPr>
+    </w:p>
+    <w:p>
+      <w:pPr>
         <w:pStyle w:val="Paragrafoelenco"/>
         <w:numPr>
           <w:ilvl w:val="0"/>
@@ -2452,13 +2232,8 @@
           <w:numId w:val="13"/>
         </w:numPr>
       </w:pPr>
-      <w:proofErr w:type="gramStart"/>
-      <w:r>
-        <w:t>Trend</w:t>
-      </w:r>
-      <w:proofErr w:type="gramEnd"/>
-      <w:r>
-        <w:t xml:space="preserve"> di fondo positivo: Nonostante le oscillazioni, tutte le serie mostrano una pendenza positiva nel lungo periodo. Questo riflette la crescita economica generale e l'inflazione monetaria nel decennio 2016-2026.</w:t>
+      <w:r>
+        <w:t>Trend di fondo positivo: Nonostante le oscillazioni, tutte le serie mostrano una pendenza positiva nel lungo periodo. Questo riflette la crescita economica generale e l'inflazione monetaria nel decennio 2016-2026.</w:t>
       </w:r>
     </w:p>
     <w:p>
@@ -2475,13 +2250,7 @@
         <w:t>. I</w:t>
       </w:r>
       <w:r>
-        <w:t xml:space="preserve"> crolli (</w:t>
-      </w:r>
-      <w:r>
-        <w:t>marzo</w:t>
-      </w:r>
-      <w:r>
-        <w:t xml:space="preserve"> 2020, inizio 2022) avvengono nello stesso momento per tutti. Questo dimostra l'esistenza di un </w:t>
+        <w:t xml:space="preserve"> crolli (marzo 2020, inizio 2022) avvengono nello stesso momento per tutti. Questo dimostra l'esistenza di un </w:t>
       </w:r>
       <w:r>
         <w:t>r</w:t>
@@ -2517,25 +2286,12 @@
     </w:p>
     <w:p>
       <w:r>
-        <w:t xml:space="preserve">Sebbene l'analisi utilizzi dati aggregati (ETF), l'elevata correlazione osservata tra comparti affini (come Tecnologia e Beni di Consumo Ciclici) suggerisce una forte coerenza nei movimenti delle società sottostanti. Il fatto che gli ETF di settore mostrino </w:t>
-      </w:r>
-      <w:proofErr w:type="gramStart"/>
-      <w:r>
-        <w:t>trend direzionali chiari</w:t>
-      </w:r>
-      <w:proofErr w:type="gramEnd"/>
-      <w:r>
-        <w:t xml:space="preserve"> e non una varianza casuale conferma che le società appartenenti allo stesso ambito industriale reagiscono in modo omogeneo agli stimoli macroeconomici, convalidando l'ipotesi di correlazione positiva intra-settoriale.</w:t>
+        <w:t>Sebbene l'analisi utilizzi dati aggregati (ETF), l'elevata correlazione osservata tra comparti affini (come Tecnologia e Beni di Consumo Ciclici) suggerisce una forte coerenza nei movimenti delle società sottostanti. Il fatto che gli ETF di settore mostrino trend direzionali chiari e non una varianza casuale conferma che le società appartenenti allo stesso ambito industriale reagiscono in modo omogeneo agli stimoli macroeconomici, convalidando l'ipotesi di correlazione positiva intra-settoriale.</w:t>
       </w:r>
     </w:p>
     <w:p>
       <w:r>
         <w:t>iii. Momenti di rendimenti lontani dalla media e notizie</w:t>
-      </w:r>
-    </w:p>
-    <w:p>
-      <w:r>
-        <w:t>I rendimenti lontani dalla media sono i picchi nel grafico dei rendimenti logaritmici. Ecco i principali eventi storici che spiegano queste anomalie nel dataset:</w:t>
       </w:r>
     </w:p>
     <w:p>
@@ -2546,15 +2302,7 @@
         </w:numPr>
       </w:pPr>
       <w:r>
-        <w:t xml:space="preserve">Febbraio - </w:t>
-      </w:r>
-      <w:proofErr w:type="gramStart"/>
-      <w:r>
-        <w:t>Marzo</w:t>
-      </w:r>
-      <w:proofErr w:type="gramEnd"/>
-      <w:r>
-        <w:t xml:space="preserve"> 2020:</w:t>
+        <w:t>Febbraio - Marzo 2020:</w:t>
       </w:r>
     </w:p>
     <w:p>
@@ -2565,15 +2313,7 @@
         </w:numPr>
       </w:pPr>
       <w:r>
-        <w:t>Rendimenti: Fortemente negativi (</w:t>
-      </w:r>
-      <w:proofErr w:type="spellStart"/>
-      <w:r>
-        <w:t>outlier</w:t>
-      </w:r>
-      <w:proofErr w:type="spellEnd"/>
-      <w:r>
-        <w:t xml:space="preserve"> estremi).</w:t>
+        <w:t>Rendimenti: Fortemente negativi (outlier estremi).</w:t>
       </w:r>
     </w:p>
     <w:p>
@@ -2648,15 +2388,7 @@
         </w:numPr>
       </w:pPr>
       <w:r>
-        <w:t xml:space="preserve">Rendimenti: </w:t>
-      </w:r>
-      <w:proofErr w:type="spellStart"/>
-      <w:r>
-        <w:t>Outlier</w:t>
-      </w:r>
-      <w:proofErr w:type="spellEnd"/>
-      <w:r>
-        <w:t xml:space="preserve"> positivi concentrati in XLK.</w:t>
+        <w:t>Rendimenti: Outlier positivi concentrati in XLK.</w:t>
       </w:r>
     </w:p>
     <w:p>
@@ -2692,15 +2424,7 @@
         <w:t>Rendimenti:</w:t>
       </w:r>
       <w:r>
-        <w:t xml:space="preserve"> </w:t>
-      </w:r>
-      <w:proofErr w:type="spellStart"/>
-      <w:r>
-        <w:t>outlier</w:t>
-      </w:r>
-      <w:proofErr w:type="spellEnd"/>
-      <w:r>
-        <w:t xml:space="preserve"> positivi per le industrie domestiche e incertezza per i settori dipendenti dalle supply chain globali</w:t>
+        <w:t xml:space="preserve"> outlier positivi per le industrie domestiche e incertezza per i settori dipendenti dalle supply chain globali</w:t>
       </w:r>
       <w:r>
         <w:t>.</w:t>
@@ -2714,14 +2438,12 @@
         </w:numPr>
       </w:pPr>
       <w:r>
-        <w:lastRenderedPageBreak/>
         <w:t xml:space="preserve">Notizia: </w:t>
       </w:r>
       <w:r>
         <w:t>L'entrata in carica della nuova presidenza negli Stati Uniti ha portato a speculazioni su nuovi dazi commerciali e cambiamenti nelle politiche sui sussidi per l'energia verde.</w:t>
       </w:r>
     </w:p>
-    <w:p/>
     <w:p>
       <w:pPr>
         <w:pStyle w:val="Paragrafoelenco"/>
@@ -2739,74 +2461,8 @@
           <w:i/>
           <w:iCs/>
         </w:rPr>
-        <w:t xml:space="preserve">Creare grafici diagnostici a </w:t>
-      </w:r>
-      <w:r>
-        <w:rPr>
-          <w:i/>
-          <w:iCs/>
-        </w:rPr>
-        <w:t>tre</w:t>
-      </w:r>
-      <w:r>
-        <w:rPr>
-          <w:i/>
-          <w:iCs/>
-        </w:rPr>
-        <w:t xml:space="preserve"> sezioni (istogramma e kernel </w:t>
-      </w:r>
-      <w:proofErr w:type="spellStart"/>
-      <w:r>
-        <w:rPr>
-          <w:i/>
-          <w:iCs/>
-        </w:rPr>
-        <w:t>density</w:t>
-      </w:r>
-      <w:proofErr w:type="spellEnd"/>
-      <w:r>
-        <w:rPr>
-          <w:i/>
-          <w:iCs/>
-        </w:rPr>
-        <w:t xml:space="preserve">, </w:t>
-      </w:r>
-      <w:proofErr w:type="spellStart"/>
-      <w:r>
-        <w:rPr>
-          <w:i/>
-          <w:iCs/>
-        </w:rPr>
-        <w:t>boxplot</w:t>
-      </w:r>
-      <w:proofErr w:type="spellEnd"/>
-      <w:r>
-        <w:rPr>
-          <w:i/>
-          <w:iCs/>
-        </w:rPr>
-        <w:t xml:space="preserve">, </w:t>
-      </w:r>
-      <w:proofErr w:type="spellStart"/>
-      <w:r>
-        <w:rPr>
-          <w:i/>
-          <w:iCs/>
-        </w:rPr>
-        <w:t>qq</w:t>
-      </w:r>
-      <w:proofErr w:type="spellEnd"/>
-      <w:r>
-        <w:rPr>
-          <w:i/>
-          <w:iCs/>
-        </w:rPr>
-        <w:t>-plot) per ciascuna serie di rendimenti e commentare</w:t>
-      </w:r>
-    </w:p>
-    <w:p>
-      <w:r>
-        <w:t>Per verificare la natura statistica dei rendimenti e la loro aderenza ai modelli teorici, è stata effettuata una diagnostica a tre sezioni per ciascun ETF.</w:t>
+        <w:lastRenderedPageBreak/>
+        <w:t>Creare grafici diagnostici a tre sezioni (istogramma e kernel density, boxplot, qq-plot) per ciascuna serie di rendimenti e commentare</w:t>
       </w:r>
     </w:p>
     <w:p>
@@ -2822,15 +2478,7 @@
         </w:numPr>
       </w:pPr>
       <w:r>
-        <w:t xml:space="preserve">Istogramma e Kernel </w:t>
-      </w:r>
-      <w:proofErr w:type="spellStart"/>
-      <w:r>
-        <w:t>Density</w:t>
-      </w:r>
-      <w:proofErr w:type="spellEnd"/>
-      <w:r>
-        <w:t xml:space="preserve"> (KDE): Permette di visualizzare la forma della distribuzione. La curva KDE (la linea continua) viene confrontata con la curva teorica della Normale (campana di Gauss).</w:t>
+        <w:t>Istogramma e Kernel Density (KDE): Permette di visualizzare la forma della distribuzione. La curva KDE (la linea continua) viene confrontata con la curva teorica della Normale (campana di Gauss).</w:t>
       </w:r>
     </w:p>
     <w:p>
@@ -2840,21 +2488,8 @@
           <w:numId w:val="16"/>
         </w:numPr>
       </w:pPr>
-      <w:proofErr w:type="spellStart"/>
-      <w:r>
-        <w:t>Boxplot</w:t>
-      </w:r>
-      <w:proofErr w:type="spellEnd"/>
-      <w:r>
-        <w:t xml:space="preserve">: Focalizza l'attenzione sulla dispersione e sulla presenza di valori estremi. La "scatola" rappresenta il 50% dei dati centrali, mentre i punti isolati oltre i "baffi" indicano gli </w:t>
-      </w:r>
-      <w:proofErr w:type="spellStart"/>
-      <w:r>
-        <w:t>outlier</w:t>
-      </w:r>
-      <w:proofErr w:type="spellEnd"/>
-      <w:r>
-        <w:t>.</w:t>
+      <w:r>
+        <w:t>Boxplot: Focalizza l'attenzione sulla dispersione e sulla presenza di valori estremi. La "scatola" rappresenta il 50% dei dati centrali, mentre i punti isolati oltre i "baffi" indicano gli outlier.</w:t>
       </w:r>
     </w:p>
     <w:p>
@@ -2875,7 +2510,7 @@
           <w:noProof/>
         </w:rPr>
         <w:drawing>
-          <wp:inline distT="0" distB="0" distL="0" distR="0" wp14:anchorId="63C1DE93" wp14:editId="4D169E6D">
+          <wp:inline distT="0" distB="0" distL="0" distR="0" wp14:anchorId="63C1DE93" wp14:editId="5BDF176B">
             <wp:extent cx="6019800" cy="1648918"/>
             <wp:effectExtent l="0" t="0" r="0" b="8890"/>
             <wp:docPr id="1506789268" name="Immagine 13"/>
@@ -2921,7 +2556,7 @@
           <w:noProof/>
         </w:rPr>
         <w:drawing>
-          <wp:inline distT="0" distB="0" distL="0" distR="0" wp14:anchorId="52E41528" wp14:editId="158FEA27">
+          <wp:inline distT="0" distB="0" distL="0" distR="0" wp14:anchorId="52E41528" wp14:editId="43883827">
             <wp:extent cx="6036733" cy="1653556"/>
             <wp:effectExtent l="0" t="0" r="2540" b="3810"/>
             <wp:docPr id="1884105364" name="Immagine 15"/>
@@ -2967,7 +2602,7 @@
           <w:noProof/>
         </w:rPr>
         <w:drawing>
-          <wp:inline distT="0" distB="0" distL="0" distR="0" wp14:anchorId="27E98227" wp14:editId="393EA038">
+          <wp:inline distT="0" distB="0" distL="0" distR="0" wp14:anchorId="27E98227" wp14:editId="21FB5F6A">
             <wp:extent cx="6120130" cy="1675130"/>
             <wp:effectExtent l="0" t="0" r="0" b="1270"/>
             <wp:docPr id="629118011" name="Immagine 16"/>
@@ -3014,7 +2649,7 @@
         </w:rPr>
         <w:lastRenderedPageBreak/>
         <w:drawing>
-          <wp:inline distT="0" distB="0" distL="0" distR="0" wp14:anchorId="1ADD2DC4" wp14:editId="14803578">
+          <wp:inline distT="0" distB="0" distL="0" distR="0" wp14:anchorId="1ADD2DC4" wp14:editId="63E9F8D1">
             <wp:extent cx="6036310" cy="1653441"/>
             <wp:effectExtent l="0" t="0" r="2540" b="4445"/>
             <wp:docPr id="1939666399" name="Immagine 18"/>
@@ -3060,7 +2695,7 @@
           <w:noProof/>
         </w:rPr>
         <w:drawing>
-          <wp:inline distT="0" distB="0" distL="0" distR="0" wp14:anchorId="1547BDD5" wp14:editId="7947F189">
+          <wp:inline distT="0" distB="0" distL="0" distR="0" wp14:anchorId="1547BDD5" wp14:editId="0F66557B">
             <wp:extent cx="6120130" cy="1676400"/>
             <wp:effectExtent l="0" t="0" r="0" b="0"/>
             <wp:docPr id="1507073771" name="Immagine 14"/>
@@ -3108,7 +2743,7 @@
           <w:noProof/>
         </w:rPr>
         <w:drawing>
-          <wp:inline distT="0" distB="0" distL="0" distR="0" wp14:anchorId="63ABEC11" wp14:editId="52DCBCE8">
+          <wp:inline distT="0" distB="0" distL="0" distR="0" wp14:anchorId="63ABEC11" wp14:editId="7DB7CDFD">
             <wp:extent cx="6120130" cy="1676400"/>
             <wp:effectExtent l="0" t="0" r="0" b="0"/>
             <wp:docPr id="1283836686" name="Immagine 19"/>
@@ -3173,15 +2808,7 @@
         </w:numPr>
       </w:pPr>
       <w:r>
-        <w:t xml:space="preserve">Settori ad alta dispersione (es. XLK, XLE): Gli istogrammi sono più "larghi" e i </w:t>
-      </w:r>
-      <w:proofErr w:type="spellStart"/>
-      <w:r>
-        <w:t>boxplot</w:t>
-      </w:r>
-      <w:proofErr w:type="spellEnd"/>
-      <w:r>
-        <w:t xml:space="preserve"> hanno baffi più estesi. Questo indica una maggiore volatilità e un rischio più elevato.</w:t>
+        <w:t>Settori ad alta dispersione (es. XLK, XLE): Gli istogrammi sono più larghi e i boxplot hanno baffi più estesi. Questo indica una maggiore volatilità e un rischio più elevato.</w:t>
       </w:r>
     </w:p>
     <w:p>
@@ -3192,7 +2819,7 @@
         </w:numPr>
       </w:pPr>
       <w:r>
-        <w:t>Settori a bassa dispersione (es. XLV): La distribuzione è più "stretta" e appuntita attorno allo zero, confermando la natura difensiva del settore sanitario.</w:t>
+        <w:t>Settori a bassa dispersione (es. XLV): La distribuzione è più stretta e appuntita attorno allo zero, confermando la natura difensiva del settore sanitario.</w:t>
       </w:r>
     </w:p>
     <w:p>
@@ -3212,13 +2839,8 @@
           <w:numId w:val="18"/>
         </w:numPr>
       </w:pPr>
-      <w:proofErr w:type="spellStart"/>
-      <w:r>
-        <w:t>Leptocurtosi</w:t>
-      </w:r>
-      <w:proofErr w:type="spellEnd"/>
-      <w:r>
-        <w:t xml:space="preserve"> (Fat Tails): Nel QQ-Plot, i punti alle estremità (code) si staccano drasticamente dalla linea retta, formando una "S". Questo significa che gli eventi estremi capitano molto più spesso di quanto previsto dalla statistica classica.</w:t>
+      <w:r>
+        <w:t>Leptocurtosi (Fat Tails): Nel QQ-Plot, i punti alle estremità (code) si staccano drasticamente dalla linea retta, formando una "S". Questo significa che gli eventi estremi capitano molto più spesso di quanto previsto dalla statistica classica.</w:t>
       </w:r>
     </w:p>
     <w:p>
@@ -3235,33 +2857,12 @@
     <w:p>
       <w:r>
         <w:lastRenderedPageBreak/>
-        <w:t xml:space="preserve">iii. Presenza di </w:t>
-      </w:r>
-      <w:proofErr w:type="spellStart"/>
-      <w:r>
-        <w:t>Outlier</w:t>
-      </w:r>
-      <w:proofErr w:type="spellEnd"/>
-    </w:p>
-    <w:p>
-      <w:r>
-        <w:t xml:space="preserve">Il </w:t>
-      </w:r>
-      <w:proofErr w:type="spellStart"/>
-      <w:r>
-        <w:t>Boxplot</w:t>
-      </w:r>
-      <w:proofErr w:type="spellEnd"/>
-      <w:r>
-        <w:t xml:space="preserve"> rivela una presenza massiccia di </w:t>
-      </w:r>
-      <w:proofErr w:type="spellStart"/>
-      <w:r>
-        <w:t>outlier</w:t>
-      </w:r>
-      <w:proofErr w:type="spellEnd"/>
-      <w:r>
-        <w:t>, rappresentati come punti neri o cerchietti oltre i baffi:</w:t>
+        <w:t>iii. Presenza di Outlier</w:t>
+      </w:r>
+    </w:p>
+    <w:p>
+      <w:r>
+        <w:t>Il Boxplot rivela una presenza massiccia di outlier, rappresentati come cerchietti oltre i baffi:</w:t>
       </w:r>
     </w:p>
     <w:p>
@@ -3271,29 +2872,8 @@
           <w:numId w:val="19"/>
         </w:numPr>
       </w:pPr>
-      <w:proofErr w:type="spellStart"/>
-      <w:r>
-        <w:t>Outlier</w:t>
-      </w:r>
-      <w:proofErr w:type="spellEnd"/>
-      <w:r>
-        <w:t xml:space="preserve"> Negativi: Sono i più numerosi e distanti. Rappresentano i giorni di "</w:t>
-      </w:r>
-      <w:proofErr w:type="spellStart"/>
-      <w:r>
-        <w:t>panic</w:t>
-      </w:r>
-      <w:proofErr w:type="spellEnd"/>
-      <w:r>
-        <w:t xml:space="preserve"> selling" (es. </w:t>
-      </w:r>
-      <w:proofErr w:type="gramStart"/>
-      <w:r>
-        <w:t>Marzo</w:t>
-      </w:r>
-      <w:proofErr w:type="gramEnd"/>
-      <w:r>
-        <w:t xml:space="preserve"> 2020 o le correzioni del 2022/2025).</w:t>
+      <w:r>
+        <w:t>Outlier Negativi: Sono i più numerosi e distanti. Rappresentano i giorni di panic selling (es. Marzo 2020 o le correzioni del 2022/2025).</w:t>
       </w:r>
     </w:p>
     <w:p>
@@ -3303,13 +2883,8 @@
           <w:numId w:val="19"/>
         </w:numPr>
       </w:pPr>
-      <w:proofErr w:type="spellStart"/>
-      <w:r>
-        <w:t>Outlier</w:t>
-      </w:r>
-      <w:proofErr w:type="spellEnd"/>
-      <w:r>
-        <w:t xml:space="preserve"> Positivi: Sebbene presenti, sono spesso meno estremi di quelli negativi, confermando l'asimmetria negativa dei mercati azionari.</w:t>
+      <w:r>
+        <w:t>Outlier Positivi: Sebbene presenti, sono spesso meno estremi di quelli negativi, confermando l'asimmetria negativa dei mercati azionari.</w:t>
       </w:r>
     </w:p>
     <w:p>
@@ -3317,23 +2892,7 @@
         <w:t>In conclusione, l</w:t>
       </w:r>
       <w:r>
-        <w:t xml:space="preserve">'analisi diagnostica conferma che i rendimenti degli ETF selezionati non sono distribuiti normalmente. La presenza di 'code grasse' (osservabili nel QQ-Plot) e di numerosi </w:t>
-      </w:r>
-      <w:proofErr w:type="spellStart"/>
-      <w:r>
-        <w:t>outlier</w:t>
-      </w:r>
-      <w:proofErr w:type="spellEnd"/>
-      <w:r>
-        <w:t xml:space="preserve"> (evidenziati nei </w:t>
-      </w:r>
-      <w:proofErr w:type="spellStart"/>
-      <w:r>
-        <w:t>Boxplot</w:t>
-      </w:r>
-      <w:proofErr w:type="spellEnd"/>
-      <w:r>
-        <w:t>) suggerisce che i modelli che assumono la normalità dei dati potrebbero sottostimare il rischio di perdite estreme. In particolare, il settore Tecnologico (XLK) e quello Energetico (XLE) mostrano la dispersione più elevata, mentre il settore Sanitario (XLV) si conferma il più stabile, pur non essendo immune da shock sistemici.</w:t>
+        <w:t>'analisi diagnostica conferma che i rendimenti degli ETF selezionati non sono distribuiti normalmente. La presenza di 'code grasse' (osservabili nel QQ-Plot) e di numerosi outlier (evidenziati nei Boxplot) suggerisce che i modelli che assumono la normalità dei dati potrebbero sottostimare il rischio di perdite estreme. In particolare, il settore Tecnologico (XLK) e quello Energetico (XLE) mostrano la dispersione più elevata, mentre il settore Sanitario (XLV) si conferma il più stabile, pur non essendo immune da shock sistemici.</w:t>
       </w:r>
     </w:p>
     <w:p/>
@@ -3354,23 +2913,7 @@
           <w:i/>
           <w:iCs/>
         </w:rPr>
-        <w:t xml:space="preserve">Calcolare statistiche descrittive </w:t>
-      </w:r>
-      <w:proofErr w:type="spellStart"/>
-      <w:r>
-        <w:rPr>
-          <w:i/>
-          <w:iCs/>
-        </w:rPr>
-        <w:t>univariate</w:t>
-      </w:r>
-      <w:proofErr w:type="spellEnd"/>
-      <w:r>
-        <w:rPr>
-          <w:i/>
-          <w:iCs/>
-        </w:rPr>
-        <w:t xml:space="preserve"> annualizzate per ogni serie di rendimenti e commentare</w:t>
+        <w:t>Calcolare statistiche descrittive univariate annualizzate per ogni serie di rendimenti e commentare</w:t>
       </w:r>
     </w:p>
     <w:tbl>
@@ -3612,6 +3155,9 @@
           </w:tcPr>
           <w:p>
             <w:r>
+              <w:rPr>
+                <w:highlight w:val="green"/>
+              </w:rPr>
               <w:t>18.629</w:t>
             </w:r>
           </w:p>
@@ -3641,7 +3187,15 @@
             <w:tcW w:w="1397" w:type="dxa"/>
           </w:tcPr>
           <w:p>
+            <w:pPr>
+              <w:rPr>
+                <w:highlight w:val="green"/>
+              </w:rPr>
+            </w:pPr>
             <w:r>
+              <w:rPr>
+                <w:highlight w:val="green"/>
+              </w:rPr>
               <w:t>-0.312</w:t>
             </w:r>
           </w:p>
@@ -3683,7 +3237,16 @@
             <w:tcW w:w="1984" w:type="dxa"/>
           </w:tcPr>
           <w:p>
+            <w:pPr>
+              <w:rPr>
+                <w:highlight w:val="red"/>
+              </w:rPr>
+            </w:pPr>
             <w:r>
+              <w:rPr>
+                <w:color w:val="000000" w:themeColor="text1"/>
+                <w:highlight w:val="red"/>
+              </w:rPr>
               <w:t>9.219</w:t>
             </w:r>
           </w:p>
@@ -3694,6 +3257,9 @@
           </w:tcPr>
           <w:p>
             <w:r>
+              <w:rPr>
+                <w:highlight w:val="red"/>
+              </w:rPr>
               <w:t>16.549</w:t>
             </w:r>
           </w:p>
@@ -3704,6 +3270,9 @@
           </w:tcPr>
           <w:p>
             <w:r>
+              <w:rPr>
+                <w:highlight w:val="red"/>
+              </w:rPr>
               <w:t>0.027</w:t>
             </w:r>
           </w:p>
@@ -3766,6 +3335,9 @@
           </w:tcPr>
           <w:p>
             <w:r>
+              <w:rPr>
+                <w:highlight w:val="green"/>
+              </w:rPr>
               <w:t>29.681</w:t>
             </w:r>
           </w:p>
@@ -3776,6 +3348,9 @@
           </w:tcPr>
           <w:p>
             <w:r>
+              <w:rPr>
+                <w:highlight w:val="green"/>
+              </w:rPr>
               <w:t>0.088</w:t>
             </w:r>
           </w:p>
@@ -3785,7 +3360,15 @@
             <w:tcW w:w="1397" w:type="dxa"/>
           </w:tcPr>
           <w:p>
+            <w:pPr>
+              <w:rPr>
+                <w:highlight w:val="red"/>
+              </w:rPr>
+            </w:pPr>
             <w:r>
+              <w:rPr>
+                <w:highlight w:val="red"/>
+              </w:rPr>
               <w:t>-0.966</w:t>
             </w:r>
           </w:p>
@@ -3796,6 +3379,9 @@
           </w:tcPr>
           <w:p>
             <w:r>
+              <w:rPr>
+                <w:highlight w:val="green"/>
+              </w:rPr>
               <w:t>17.129</w:t>
             </w:r>
           </w:p>
@@ -3940,6 +3526,9 @@
           </w:tcPr>
           <w:p>
             <w:r>
+              <w:rPr>
+                <w:highlight w:val="red"/>
+              </w:rPr>
               <w:t>9.119</w:t>
             </w:r>
           </w:p>
@@ -3949,11 +3538,6 @@
     <w:p/>
     <w:p>
       <w:r>
-        <w:t>Dall'analisi dei dati annualizzati emergono evidenze fondamentali sul profilo di rischio e rendimento dei settori selezionati nel periodo 2016-2026.</w:t>
-      </w:r>
-    </w:p>
-    <w:p>
-      <w:r>
         <w:t>i. Rendimento più basso e più alto</w:t>
       </w:r>
     </w:p>
@@ -4008,7 +3592,6 @@
     </w:p>
     <w:p>
       <w:r>
-        <w:lastRenderedPageBreak/>
         <w:t>iii. Evoluzione nel tempo di rendimento e volatilità</w:t>
       </w:r>
     </w:p>
@@ -4025,6 +3608,7 @@
         </w:numPr>
       </w:pPr>
       <w:r>
+        <w:lastRenderedPageBreak/>
         <w:t>Rendimento: Si evolve con una dinamica a "salti". Mentre il rendimento medio è positivo, nel breve termine è influenzato da shock che portano a correzioni rapide (evidenziate dall'asimmetria negativa in tabella).</w:t>
       </w:r>
     </w:p>
@@ -4036,15 +3620,13 @@
         </w:numPr>
       </w:pPr>
       <w:r>
-        <w:t xml:space="preserve">Volatilità: Tende a essere persistente (fenomeno del </w:t>
-      </w:r>
-      <w:proofErr w:type="spellStart"/>
-      <w:r>
-        <w:t>volatility</w:t>
-      </w:r>
-      <w:proofErr w:type="spellEnd"/>
-      <w:r>
-        <w:t xml:space="preserve"> clustering). Quando la volatilità aumenta (come suggerito dai valori di Curtosi elevati che indicano "code grasse"), rimane alta per un certo periodo prima di tornare alla media. In particolare, settori come XLF e XLE mostrano un'evoluzione più turbolenta rispetto alla relativa calma di XLI o XLV.</w:t>
+        <w:t>Volatilità: Tende a essere persistente</w:t>
+      </w:r>
+      <w:r>
+        <w:t>; q</w:t>
+      </w:r>
+      <w:r>
+        <w:t>uando la volatilità aumenta (come suggerito dai valori di Curtosi elevati che indicano code grasse), rimane alta per un certo periodo prima di tornare alla media. In particolare, settori come XLF e XLE mostrano un'evoluzione più turbolenta rispetto alla relativa calma di XLI o XLV.</w:t>
       </w:r>
     </w:p>
     <w:p>
@@ -4060,15 +3642,7 @@
         </w:numPr>
       </w:pPr>
       <w:r>
-        <w:t>La più lontana dalla normale: È il settore XLE (Energy). Ha la Curtosi più alta in assoluto (17,129) e l'Asimmetria più negativa (-0,966). Questo significa che i suoi rendimenti sono estremamente imprevedibili, con una frequenza di eventi catastrofici (</w:t>
-      </w:r>
-      <w:proofErr w:type="spellStart"/>
-      <w:r>
-        <w:t>outlier</w:t>
-      </w:r>
-      <w:proofErr w:type="spellEnd"/>
-      <w:r>
-        <w:t xml:space="preserve"> negativi) molto superiore a quanto previsto da un modello teorico normale. Anche XLF è molto distante con una curtosi di 15,869.</w:t>
+        <w:t>La più lontana dalla normale: È il settore XLE (Energy). Ha la Curtosi più alta in assoluto (17,129) e l'Asimmetria più negativa (-0,966). Questo significa che i suoi rendimenti sono estremamente imprevedibili, con una frequenza di eventi catastrofici molto superiore a quanto previsto da un modello teorico normale. Anche XLF è molto distante con una curtosi di 15,869.</w:t>
       </w:r>
     </w:p>
     <w:p>
@@ -4079,15 +3653,7 @@
         </w:numPr>
       </w:pPr>
       <w:r>
-        <w:t xml:space="preserve">La più vicina alla normale: Tra tutte, la distribuzione più "regolare" (anche se comunque non normale) è quella di XLY (Consumer </w:t>
-      </w:r>
-      <w:proofErr w:type="spellStart"/>
-      <w:r>
-        <w:t>Discretionary</w:t>
-      </w:r>
-      <w:proofErr w:type="spellEnd"/>
-      <w:r>
-        <w:t>). Ha la Curtosi più bassa del gruppo (9,119) e un'Asimmetria di -0,581. Pur essendo un valore alto, è il meno estremo del dataset, indicando rendimenti che, seppur volatili, seguono una distribuzione leggermente meno "esplosiva" rispetto a banche o energia.</w:t>
+        <w:t>La più vicina alla normale: Tra tutte, la distribuzione più regolare (anche se comunque non normale) è quella di XLY (Consumer Discretionary). Ha la Curtosi più bassa del gruppo (9,119) e un'Asimmetria di -0,581. Pur essendo un valore alto, è il meno estremo del dataset, indicando rendimenti che, seppur volatili, seguono una distribuzione leggermente meno esplosiva rispetto a banche o energia.</w:t>
       </w:r>
     </w:p>
     <w:p/>
@@ -4111,6 +3677,576 @@
         <w:t>Calcolare la matrice di varianze/covarianze e di correlazione dei rendimenti mensili</w:t>
       </w:r>
     </w:p>
+    <w:p>
+      <w:r>
+        <w:rPr>
+          <w:noProof/>
+        </w:rPr>
+        <w:drawing>
+          <wp:inline distT="0" distB="0" distL="0" distR="0" wp14:anchorId="37A0C5A3" wp14:editId="2DCADD9A">
+            <wp:extent cx="3078480" cy="2694550"/>
+            <wp:effectExtent l="0" t="0" r="7620" b="0"/>
+            <wp:docPr id="913097491" name="Immagine 4"/>
+            <wp:cNvGraphicFramePr>
+              <a:graphicFrameLocks xmlns:a="http://schemas.openxmlformats.org/drawingml/2006/main" noChangeAspect="1"/>
+            </wp:cNvGraphicFramePr>
+            <a:graphic xmlns:a="http://schemas.openxmlformats.org/drawingml/2006/main">
+              <a:graphicData uri="http://schemas.openxmlformats.org/drawingml/2006/picture">
+                <pic:pic xmlns:pic="http://schemas.openxmlformats.org/drawingml/2006/picture">
+                  <pic:nvPicPr>
+                    <pic:cNvPr id="913097491" name="Immagine 913097491"/>
+                    <pic:cNvPicPr/>
+                  </pic:nvPicPr>
+                  <pic:blipFill>
+                    <a:blip r:embed="rId22" cstate="print">
+                      <a:extLst>
+                        <a:ext uri="{28A0092B-C50C-407E-A947-70E740481C1C}">
+                          <a14:useLocalDpi xmlns:a14="http://schemas.microsoft.com/office/drawing/2010/main" val="0"/>
+                        </a:ext>
+                      </a:extLst>
+                    </a:blip>
+                    <a:stretch>
+                      <a:fillRect/>
+                    </a:stretch>
+                  </pic:blipFill>
+                  <pic:spPr>
+                    <a:xfrm>
+                      <a:off x="0" y="0"/>
+                      <a:ext cx="3080193" cy="2696049"/>
+                    </a:xfrm>
+                    <a:prstGeom prst="rect">
+                      <a:avLst/>
+                    </a:prstGeom>
+                  </pic:spPr>
+                </pic:pic>
+              </a:graphicData>
+            </a:graphic>
+          </wp:inline>
+        </w:drawing>
+      </w:r>
+      <w:r>
+        <w:rPr>
+          <w:noProof/>
+        </w:rPr>
+        <w:drawing>
+          <wp:inline distT="0" distB="0" distL="0" distR="0" wp14:anchorId="02D01794" wp14:editId="36B2A02E">
+            <wp:extent cx="3007360" cy="2692833"/>
+            <wp:effectExtent l="0" t="0" r="2540" b="0"/>
+            <wp:docPr id="408608569" name="Immagine 3"/>
+            <wp:cNvGraphicFramePr>
+              <a:graphicFrameLocks xmlns:a="http://schemas.openxmlformats.org/drawingml/2006/main" noChangeAspect="1"/>
+            </wp:cNvGraphicFramePr>
+            <a:graphic xmlns:a="http://schemas.openxmlformats.org/drawingml/2006/main">
+              <a:graphicData uri="http://schemas.openxmlformats.org/drawingml/2006/picture">
+                <pic:pic xmlns:pic="http://schemas.openxmlformats.org/drawingml/2006/picture">
+                  <pic:nvPicPr>
+                    <pic:cNvPr id="408608569" name="Immagine 408608569"/>
+                    <pic:cNvPicPr/>
+                  </pic:nvPicPr>
+                  <pic:blipFill>
+                    <a:blip r:embed="rId23" cstate="print">
+                      <a:extLst>
+                        <a:ext uri="{28A0092B-C50C-407E-A947-70E740481C1C}">
+                          <a14:useLocalDpi xmlns:a14="http://schemas.microsoft.com/office/drawing/2010/main" val="0"/>
+                        </a:ext>
+                      </a:extLst>
+                    </a:blip>
+                    <a:stretch>
+                      <a:fillRect/>
+                    </a:stretch>
+                  </pic:blipFill>
+                  <pic:spPr>
+                    <a:xfrm>
+                      <a:off x="0" y="0"/>
+                      <a:ext cx="3010610" cy="2695743"/>
+                    </a:xfrm>
+                    <a:prstGeom prst="rect">
+                      <a:avLst/>
+                    </a:prstGeom>
+                  </pic:spPr>
+                </pic:pic>
+              </a:graphicData>
+            </a:graphic>
+          </wp:inline>
+        </w:drawing>
+      </w:r>
+    </w:p>
+    <w:p>
+      <w:r>
+        <w:t>i. Quali sono i titoli più correlati?</w:t>
+      </w:r>
+    </w:p>
+    <w:p>
+      <w:pPr>
+        <w:numPr>
+          <w:ilvl w:val="0"/>
+          <w:numId w:val="30"/>
+        </w:numPr>
+      </w:pPr>
+      <w:r>
+        <w:t>XLF (Finanza) e XLI (Industria) → 0.843: Questa è la correlazione più alta tra due settori diversi. Indica un legame indissolubile tra l'attività industriale e il settore bancario che la finanzia. Sono i due pilastri dell'economia tradizionale.</w:t>
+      </w:r>
+    </w:p>
+    <w:p>
+      <w:pPr>
+        <w:numPr>
+          <w:ilvl w:val="0"/>
+          <w:numId w:val="30"/>
+        </w:numPr>
+      </w:pPr>
+      <w:r>
+        <w:t>XLK (Tecnologia) e XLY (Consumi Ciclici) → 0.833: Una correlazione molto forte che riflette la natura moderna del settore dei consumi (dove aziende come Amazon e Tesla dominano l'XLY, comportandosi di fatto come titoli tecnologici).</w:t>
+      </w:r>
+    </w:p>
+    <w:p>
+      <w:pPr>
+        <w:numPr>
+          <w:ilvl w:val="0"/>
+          <w:numId w:val="30"/>
+        </w:numPr>
+      </w:pPr>
+      <w:r>
+        <w:t>XLI (Industria) e XLY (Consumi Ciclici) → 0.771: Conferma che i settori ciclici tendono a salire e scendere insieme in base alle aspettative di crescita economica e fiducia dei consumatori.</w:t>
+      </w:r>
+    </w:p>
+    <w:p>
+      <w:r>
+        <w:lastRenderedPageBreak/>
+        <w:t xml:space="preserve">ii. Quali sono i titoli meno correlati? </w:t>
+      </w:r>
+    </w:p>
+    <w:p>
+      <w:pPr>
+        <w:numPr>
+          <w:ilvl w:val="0"/>
+          <w:numId w:val="31"/>
+        </w:numPr>
+      </w:pPr>
+      <w:r>
+        <w:t>XLE (Energia) e XLK (Tecnologia) → 0.322: Rimane la coppia con la correlazione più bassa in assoluto. Rappresentano due motori economici distinti: uno basato sulle risorse fisiche e l'altro sull'intangibile e l'innovazione software.</w:t>
+      </w:r>
+    </w:p>
+    <w:p>
+      <w:pPr>
+        <w:numPr>
+          <w:ilvl w:val="0"/>
+          <w:numId w:val="31"/>
+        </w:numPr>
+      </w:pPr>
+      <w:r>
+        <w:t>XLE (Energia) e XLV (Sanità) → 0.404: Un'altra coppia eccellente per la diversificazione. Il settore energetico è legato alle materie prime, mentre la sanità è legata a dinamiche demografiche e regolamentari.</w:t>
+      </w:r>
+    </w:p>
+    <w:p>
+      <w:pPr>
+        <w:numPr>
+          <w:ilvl w:val="0"/>
+          <w:numId w:val="31"/>
+        </w:numPr>
+      </w:pPr>
+      <w:r>
+        <w:t>XLE (Energia) e XLY (Consumi Ciclici) → 0.425: Anche in questo caso, la decorrelazione è netta. Spesso, l'aumento dei costi energetici (XLE sale) comprime il potere d'acquisto dei consumatori (XLY potrebbe soffrire), creando movimenti divergenti.</w:t>
+      </w:r>
+    </w:p>
+    <w:p>
+      <w:pPr>
+        <w:numPr>
+          <w:ilvl w:val="0"/>
+          <w:numId w:val="31"/>
+        </w:numPr>
+      </w:pPr>
+      <w:r>
+        <w:t>XLK (Tecnologia) e XLV (Sanità) → 0.524: Tra i settori non energetici, questa è la coppia meno correlata. Offre una buona difesa perché unisce la crescita aggressiva del Tech con la stabilità difensiva del settore farmaceutico.</w:t>
+      </w:r>
+    </w:p>
+    <w:p>
+      <w:r>
+        <w:t>L'analisi delle correlazioni esclusivamente settoriali evidenzia un mercato diviso in due blocchi. Da un lato, i settori Finanziario, Industriale, Tecnologico e dei Consumi formano un cluster ad alta integrazione (correlazioni &gt; 0.70), suggerendo che il rischio sistemico agisce su di essi in modo quasi uniforme.</w:t>
+      </w:r>
+      <w:r>
+        <w:t xml:space="preserve"> </w:t>
+      </w:r>
+      <w:r>
+        <w:t>Dall'altro, il settore Energetico (XLE) si distingue come l'unico vero asset diversificante del paniere, mantenendo correlazioni inferiori allo 0.45 con quasi tutti gli altri comparti (fatta eccezione per i settori tradizionali come Industria e Finanza). In particolare, la minima correlazione tra Energia e Tecnologia (0.322) indica che questi due settori raramente subiscono shock negativi simultanei, rendendo la loro combinazione la strategia più efficace per la riduzione della varianza di portafoglio.</w:t>
+      </w:r>
+    </w:p>
+    <w:p>
+      <w:pPr>
+        <w:pStyle w:val="NormaleWeb"/>
+      </w:pPr>
+    </w:p>
+    <w:p>
+      <w:pPr>
+        <w:rPr>
+          <w:i/>
+          <w:iCs/>
+        </w:rPr>
+      </w:pPr>
+      <w:r>
+        <w:rPr>
+          <w:i/>
+          <w:iCs/>
+        </w:rPr>
+        <w:t>g.</w:t>
+      </w:r>
+      <w:r>
+        <w:rPr>
+          <w:i/>
+          <w:iCs/>
+          <w:color w:val="212529"/>
+          <w:sz w:val="14"/>
+          <w:szCs w:val="14"/>
+          <w:shd w:val="clear" w:color="auto" w:fill="FFFFFF"/>
+        </w:rPr>
+        <w:t xml:space="preserve"> </w:t>
+      </w:r>
+      <w:r>
+        <w:rPr>
+          <w:i/>
+          <w:iCs/>
+        </w:rPr>
+        <w:t>   Fare il grafico dell’andamento nel tempo delle correlazioni fra i titoli e i grafici di dispersione (scatter plots) dei rendimenti di ciascun ETF con l’indice di mercato,</w:t>
+      </w:r>
+      <w:r>
+        <w:rPr>
+          <w:i/>
+          <w:iCs/>
+        </w:rPr>
+        <w:t xml:space="preserve"> </w:t>
+      </w:r>
+      <w:r>
+        <w:rPr>
+          <w:i/>
+          <w:iCs/>
+        </w:rPr>
+        <w:t>dai quali risulti la maggiore o minore la correlazione storica dei rendimenti</w:t>
+      </w:r>
+    </w:p>
+    <w:p>
+      <w:pPr>
+        <w:jc w:val="center"/>
+        <w:rPr>
+          <w:i/>
+          <w:iCs/>
+        </w:rPr>
+      </w:pPr>
+      <w:r>
+        <w:rPr>
+          <w:noProof/>
+        </w:rPr>
+        <w:drawing>
+          <wp:inline distT="0" distB="0" distL="0" distR="0" wp14:anchorId="1033CBEB" wp14:editId="21992A80">
+            <wp:extent cx="5086156" cy="3471333"/>
+            <wp:effectExtent l="0" t="0" r="635" b="0"/>
+            <wp:docPr id="295983357" name="Immagine 5"/>
+            <wp:cNvGraphicFramePr>
+              <a:graphicFrameLocks xmlns:a="http://schemas.openxmlformats.org/drawingml/2006/main" noChangeAspect="1"/>
+            </wp:cNvGraphicFramePr>
+            <a:graphic xmlns:a="http://schemas.openxmlformats.org/drawingml/2006/main">
+              <a:graphicData uri="http://schemas.openxmlformats.org/drawingml/2006/picture">
+                <pic:pic xmlns:pic="http://schemas.openxmlformats.org/drawingml/2006/picture">
+                  <pic:nvPicPr>
+                    <pic:cNvPr id="295983357" name="Immagine 295983357"/>
+                    <pic:cNvPicPr/>
+                  </pic:nvPicPr>
+                  <pic:blipFill>
+                    <a:blip r:embed="rId24">
+                      <a:extLst>
+                        <a:ext uri="{28A0092B-C50C-407E-A947-70E740481C1C}">
+                          <a14:useLocalDpi xmlns:a14="http://schemas.microsoft.com/office/drawing/2010/main" val="0"/>
+                        </a:ext>
+                      </a:extLst>
+                    </a:blip>
+                    <a:stretch>
+                      <a:fillRect/>
+                    </a:stretch>
+                  </pic:blipFill>
+                  <pic:spPr>
+                    <a:xfrm>
+                      <a:off x="0" y="0"/>
+                      <a:ext cx="5202943" cy="3551041"/>
+                    </a:xfrm>
+                    <a:prstGeom prst="rect">
+                      <a:avLst/>
+                    </a:prstGeom>
+                  </pic:spPr>
+                </pic:pic>
+              </a:graphicData>
+            </a:graphic>
+          </wp:inline>
+        </w:drawing>
+      </w:r>
+    </w:p>
+    <w:p>
+      <w:pPr>
+        <w:rPr>
+          <w:i/>
+          <w:iCs/>
+        </w:rPr>
+      </w:pPr>
+      <w:r>
+        <w:rPr>
+          <w:noProof/>
+        </w:rPr>
+        <w:lastRenderedPageBreak/>
+        <w:drawing>
+          <wp:inline distT="0" distB="0" distL="0" distR="0" wp14:anchorId="3AB2E4F7" wp14:editId="2F86950E">
+            <wp:extent cx="6120130" cy="3658235"/>
+            <wp:effectExtent l="0" t="0" r="0" b="0"/>
+            <wp:docPr id="2222289" name="Immagine 6"/>
+            <wp:cNvGraphicFramePr>
+              <a:graphicFrameLocks xmlns:a="http://schemas.openxmlformats.org/drawingml/2006/main" noChangeAspect="1"/>
+            </wp:cNvGraphicFramePr>
+            <a:graphic xmlns:a="http://schemas.openxmlformats.org/drawingml/2006/main">
+              <a:graphicData uri="http://schemas.openxmlformats.org/drawingml/2006/picture">
+                <pic:pic xmlns:pic="http://schemas.openxmlformats.org/drawingml/2006/picture">
+                  <pic:nvPicPr>
+                    <pic:cNvPr id="2222289" name="Immagine 2222289"/>
+                    <pic:cNvPicPr/>
+                  </pic:nvPicPr>
+                  <pic:blipFill>
+                    <a:blip r:embed="rId25" cstate="print">
+                      <a:extLst>
+                        <a:ext uri="{28A0092B-C50C-407E-A947-70E740481C1C}">
+                          <a14:useLocalDpi xmlns:a14="http://schemas.microsoft.com/office/drawing/2010/main" val="0"/>
+                        </a:ext>
+                      </a:extLst>
+                    </a:blip>
+                    <a:stretch>
+                      <a:fillRect/>
+                    </a:stretch>
+                  </pic:blipFill>
+                  <pic:spPr>
+                    <a:xfrm>
+                      <a:off x="0" y="0"/>
+                      <a:ext cx="6120130" cy="3658235"/>
+                    </a:xfrm>
+                    <a:prstGeom prst="rect">
+                      <a:avLst/>
+                    </a:prstGeom>
+                  </pic:spPr>
+                </pic:pic>
+              </a:graphicData>
+            </a:graphic>
+          </wp:inline>
+        </w:drawing>
+      </w:r>
+      <w:r>
+        <w:rPr>
+          <w:i/>
+          <w:iCs/>
+        </w:rPr>
+        <w:t xml:space="preserve"> </w:t>
+      </w:r>
+      <w:r>
+        <w:rPr>
+          <w:i/>
+          <w:iCs/>
+        </w:rPr>
+        <w:t>Scatter Plots ETF vs S&amp;P500</w:t>
+      </w:r>
+    </w:p>
+    <w:p/>
+    <w:p>
+      <w:r>
+        <w:t>i. Commento alle relazioni e andamento nel tempo</w:t>
+      </w:r>
+    </w:p>
+    <w:p>
+      <w:r>
+        <w:t xml:space="preserve">Il grafico dell'evoluzione storica mostra che la correlazione è un'entità </w:t>
+      </w:r>
+      <w:r>
+        <w:t>dinamica</w:t>
+      </w:r>
+      <w:r>
+        <w:t>:</w:t>
+      </w:r>
+    </w:p>
+    <w:p>
+      <w:pPr>
+        <w:numPr>
+          <w:ilvl w:val="0"/>
+          <w:numId w:val="32"/>
+        </w:numPr>
+      </w:pPr>
+      <w:r>
+        <w:t>Instabilità strutturale: Non esiste una correlazione fissa</w:t>
+      </w:r>
+      <w:r>
+        <w:t xml:space="preserve">: </w:t>
+      </w:r>
+      <w:r>
+        <w:t>le linee oscillano drasticamente tra 0 e 0.95.</w:t>
+      </w:r>
+    </w:p>
+    <w:p>
+      <w:pPr>
+        <w:numPr>
+          <w:ilvl w:val="0"/>
+          <w:numId w:val="32"/>
+        </w:numPr>
+      </w:pPr>
+      <w:r>
+        <w:t xml:space="preserve">Il blocco 2020-2021: </w:t>
+      </w:r>
+      <w:r>
+        <w:t>Si noti</w:t>
+      </w:r>
+      <w:r>
+        <w:t xml:space="preserve"> il plateau altissimo in corrispondenza del 2020. In quel periodo, quasi tutte le coppie di ETF si sono schiacciate verso l'alto. È il segnale che durante la pandemia i fondamentali dei singoli settori sono passati in secondo piano rispetto alla paura macroeconomica globale.</w:t>
+      </w:r>
+    </w:p>
+    <w:p>
+      <w:r>
+        <w:t>ii. Come cambia la correlazione tra ETF e mercato nel tempo?</w:t>
+      </w:r>
+    </w:p>
+    <w:p>
+      <w:r>
+        <w:t>Osservando gli Scatter Plots, i titoli mostrano coefficienti di correlazione con l'S&amp;P 500 molto alti (XLK 0.93, XLY 0.90, XLI 0.88).</w:t>
+      </w:r>
+    </w:p>
+    <w:p>
+      <w:pPr>
+        <w:numPr>
+          <w:ilvl w:val="0"/>
+          <w:numId w:val="33"/>
+        </w:numPr>
+      </w:pPr>
+      <w:r>
+        <w:t xml:space="preserve">Comportamento nei periodi di crisi: </w:t>
+      </w:r>
+      <w:r>
+        <w:t>Si notino nel</w:t>
+      </w:r>
+      <w:r>
+        <w:t xml:space="preserve"> grafico dell'evoluzione nel 2020 e all'inizio del 2025</w:t>
+      </w:r>
+      <w:r>
+        <w:t xml:space="preserve"> dei</w:t>
+      </w:r>
+      <w:r>
+        <w:t xml:space="preserve"> picchi verticali</w:t>
+      </w:r>
+      <w:r>
+        <w:t xml:space="preserve">: </w:t>
+      </w:r>
+      <w:r>
+        <w:t xml:space="preserve">è il momento in cui gli ETF diventano </w:t>
+      </w:r>
+      <w:r>
+        <w:t>un tuttuno</w:t>
+      </w:r>
+      <w:r>
+        <w:t xml:space="preserve"> con il mercato. Quando il mercato crolla, la diversificazione sparisce.</w:t>
+      </w:r>
+    </w:p>
+    <w:p>
+      <w:pPr>
+        <w:numPr>
+          <w:ilvl w:val="0"/>
+          <w:numId w:val="33"/>
+        </w:numPr>
+      </w:pPr>
+      <w:r>
+        <w:t>Divergenza post-2021: Dopo il 2021, alcune linee (specialmente quelle legate a XLE, l'energia) crollano verso lo 0.2 o lo 0.0. Questo indica che l'energia ha iniziato a muoversi per conto suo, separandosi dal trend del mercato generale.</w:t>
+      </w:r>
+    </w:p>
+    <w:p>
+      <w:r>
+        <w:t>iii. Come cambiano le correlazioni in funzione dei rendimenti?</w:t>
+      </w:r>
+    </w:p>
+    <w:p>
+      <w:pPr>
+        <w:numPr>
+          <w:ilvl w:val="0"/>
+          <w:numId w:val="34"/>
+        </w:numPr>
+      </w:pPr>
+      <w:r>
+        <w:t xml:space="preserve">Correlazione asimmetrica: </w:t>
+      </w:r>
+      <w:r>
+        <w:t>N</w:t>
+      </w:r>
+      <w:r>
+        <w:t xml:space="preserve">ella parte in basso a sinistra </w:t>
+      </w:r>
+      <w:r>
+        <w:t xml:space="preserve">degli Scatter plots </w:t>
+      </w:r>
+      <w:r>
+        <w:t>(rendimenti negativi per entrambi), i punti sono molto più vicini alla linea rossa e meno dispersi.</w:t>
+      </w:r>
+    </w:p>
+    <w:p>
+      <w:pPr>
+        <w:numPr>
+          <w:ilvl w:val="0"/>
+          <w:numId w:val="34"/>
+        </w:numPr>
+      </w:pPr>
+      <w:r>
+        <w:lastRenderedPageBreak/>
+        <w:t>Interpretazione: Questo conferma che le correlazioni aumentano quando i rendimenti sono negativi. Gli investitori tendono a vendere tutto insieme durante i crash, mentre sono più selettivi (e quindi i titoli sono più decorrelati) quando il mercato sale.</w:t>
+      </w:r>
+    </w:p>
+    <w:p>
+      <w:r>
+        <w:t>iv. La dispersione dei punti conferma la relazione lineare?</w:t>
+      </w:r>
+    </w:p>
+    <w:p>
+      <w:pPr>
+        <w:numPr>
+          <w:ilvl w:val="0"/>
+          <w:numId w:val="35"/>
+        </w:numPr>
+      </w:pPr>
+      <w:r>
+        <w:t xml:space="preserve">Conferma forte: Per XLK (0.93) e XLY (0.90), la forma è una linea quasi perfetta. Qui la relazione lineare è solidissima: se l'S&amp;P 500 si muove dell'1%, </w:t>
+      </w:r>
+      <w:r>
+        <w:t>si può</w:t>
+      </w:r>
+      <w:r>
+        <w:t xml:space="preserve"> prevedere con molta precisione quanto si muoverà l'ETF.</w:t>
+      </w:r>
+    </w:p>
+    <w:p>
+      <w:pPr>
+        <w:numPr>
+          <w:ilvl w:val="0"/>
+          <w:numId w:val="35"/>
+        </w:numPr>
+      </w:pPr>
+      <w:r>
+        <w:t xml:space="preserve">Debolezza per XLE: </w:t>
+      </w:r>
+      <w:r>
+        <w:t>Ne</w:t>
+      </w:r>
+      <w:r>
+        <w:t>l</w:t>
+      </w:r>
+      <w:r>
+        <w:t xml:space="preserve"> grafico di XLE vs S&amp;P 500 (0.61). La nuvola è molto più </w:t>
+      </w:r>
+      <w:r>
+        <w:t>dispersa</w:t>
+      </w:r>
+      <w:r>
+        <w:t>. Ci sono molti punti distanti dalla linea rossa</w:t>
+      </w:r>
+      <w:r>
+        <w:t xml:space="preserve">. </w:t>
+      </w:r>
+      <w:r>
+        <w:t>Questo suggerisce che per l'energia la relazione lineare è più debole: l'indice S&amp;P 500 spiega solo una parte del movimento di XLE, il resto è dovuto a fattori specifici (prezzo del petrolio, geopolitica).</w:t>
+      </w:r>
+    </w:p>
     <w:p/>
     <w:p/>
     <w:p/>
@@ -4118,7 +4254,7 @@
     <w:p/>
     <w:p/>
     <w:sectPr>
-      <w:headerReference w:type="default" r:id="rId22"/>
+      <w:headerReference w:type="default" r:id="rId26"/>
       <w:pgSz w:w="11906" w:h="16838"/>
       <w:pgMar w:top="1417" w:right="1134" w:bottom="1134" w:left="1134" w:header="708" w:footer="708" w:gutter="0"/>
       <w:cols w:space="708"/>
@@ -4192,14 +4328,7 @@
     </w:r>
     <w:r>
       <w:tab/>
-    </w:r>
-    <w:proofErr w:type="spellStart"/>
-    <w:r>
-      <w:t>Mat</w:t>
-    </w:r>
-    <w:proofErr w:type="spellEnd"/>
-    <w:r>
-      <w:t>. 909277</w:t>
+      <w:t>Mat. 909277</w:t>
     </w:r>
   </w:p>
 </w:hdr>
@@ -4804,6 +4933,119 @@
     </w:lvl>
   </w:abstractNum>
   <w:abstractNum w:abstractNumId="4" w15:restartNumberingAfterBreak="0">
+    <w:nsid w:val="116747C3"/>
+    <w:multiLevelType w:val="multilevel"/>
+    <w:tmpl w:val="7132E426"/>
+    <w:lvl w:ilvl="0">
+      <w:start w:val="1"/>
+      <w:numFmt w:val="decimal"/>
+      <w:lvlText w:val="%1."/>
+      <w:lvlJc w:val="left"/>
+      <w:pPr>
+        <w:tabs>
+          <w:tab w:val="num" w:pos="720"/>
+        </w:tabs>
+        <w:ind w:left="720" w:hanging="360"/>
+      </w:pPr>
+    </w:lvl>
+    <w:lvl w:ilvl="1" w:tentative="1">
+      <w:start w:val="1"/>
+      <w:numFmt w:val="decimal"/>
+      <w:lvlText w:val="%2."/>
+      <w:lvlJc w:val="left"/>
+      <w:pPr>
+        <w:tabs>
+          <w:tab w:val="num" w:pos="1440"/>
+        </w:tabs>
+        <w:ind w:left="1440" w:hanging="360"/>
+      </w:pPr>
+    </w:lvl>
+    <w:lvl w:ilvl="2" w:tentative="1">
+      <w:start w:val="1"/>
+      <w:numFmt w:val="decimal"/>
+      <w:lvlText w:val="%3."/>
+      <w:lvlJc w:val="left"/>
+      <w:pPr>
+        <w:tabs>
+          <w:tab w:val="num" w:pos="2160"/>
+        </w:tabs>
+        <w:ind w:left="2160" w:hanging="360"/>
+      </w:pPr>
+    </w:lvl>
+    <w:lvl w:ilvl="3" w:tentative="1">
+      <w:start w:val="1"/>
+      <w:numFmt w:val="decimal"/>
+      <w:lvlText w:val="%4."/>
+      <w:lvlJc w:val="left"/>
+      <w:pPr>
+        <w:tabs>
+          <w:tab w:val="num" w:pos="2880"/>
+        </w:tabs>
+        <w:ind w:left="2880" w:hanging="360"/>
+      </w:pPr>
+    </w:lvl>
+    <w:lvl w:ilvl="4" w:tentative="1">
+      <w:start w:val="1"/>
+      <w:numFmt w:val="decimal"/>
+      <w:lvlText w:val="%5."/>
+      <w:lvlJc w:val="left"/>
+      <w:pPr>
+        <w:tabs>
+          <w:tab w:val="num" w:pos="3600"/>
+        </w:tabs>
+        <w:ind w:left="3600" w:hanging="360"/>
+      </w:pPr>
+    </w:lvl>
+    <w:lvl w:ilvl="5" w:tentative="1">
+      <w:start w:val="1"/>
+      <w:numFmt w:val="decimal"/>
+      <w:lvlText w:val="%6."/>
+      <w:lvlJc w:val="left"/>
+      <w:pPr>
+        <w:tabs>
+          <w:tab w:val="num" w:pos="4320"/>
+        </w:tabs>
+        <w:ind w:left="4320" w:hanging="360"/>
+      </w:pPr>
+    </w:lvl>
+    <w:lvl w:ilvl="6" w:tentative="1">
+      <w:start w:val="1"/>
+      <w:numFmt w:val="decimal"/>
+      <w:lvlText w:val="%7."/>
+      <w:lvlJc w:val="left"/>
+      <w:pPr>
+        <w:tabs>
+          <w:tab w:val="num" w:pos="5040"/>
+        </w:tabs>
+        <w:ind w:left="5040" w:hanging="360"/>
+      </w:pPr>
+    </w:lvl>
+    <w:lvl w:ilvl="7" w:tentative="1">
+      <w:start w:val="1"/>
+      <w:numFmt w:val="decimal"/>
+      <w:lvlText w:val="%8."/>
+      <w:lvlJc w:val="left"/>
+      <w:pPr>
+        <w:tabs>
+          <w:tab w:val="num" w:pos="5760"/>
+        </w:tabs>
+        <w:ind w:left="5760" w:hanging="360"/>
+      </w:pPr>
+    </w:lvl>
+    <w:lvl w:ilvl="8" w:tentative="1">
+      <w:start w:val="1"/>
+      <w:numFmt w:val="decimal"/>
+      <w:lvlText w:val="%9."/>
+      <w:lvlJc w:val="left"/>
+      <w:pPr>
+        <w:tabs>
+          <w:tab w:val="num" w:pos="6480"/>
+        </w:tabs>
+        <w:ind w:left="6480" w:hanging="360"/>
+      </w:pPr>
+    </w:lvl>
+  </w:abstractNum>
+  <w:abstractNum w:abstractNumId="5" w15:restartNumberingAfterBreak="0">
     <w:nsid w:val="192A0AF5"/>
     <w:multiLevelType w:val="multilevel"/>
     <w:tmpl w:val="0F6CECC2"/>
@@ -4952,7 +5194,269 @@
       </w:rPr>
     </w:lvl>
   </w:abstractNum>
-  <w:abstractNum w:abstractNumId="5" w15:restartNumberingAfterBreak="0">
+  <w:abstractNum w:abstractNumId="6" w15:restartNumberingAfterBreak="0">
+    <w:nsid w:val="1D6B47FC"/>
+    <w:multiLevelType w:val="multilevel"/>
+    <w:tmpl w:val="A6D48EFE"/>
+    <w:lvl w:ilvl="0">
+      <w:start w:val="1"/>
+      <w:numFmt w:val="decimal"/>
+      <w:lvlText w:val="%1."/>
+      <w:lvlJc w:val="left"/>
+      <w:pPr>
+        <w:tabs>
+          <w:tab w:val="num" w:pos="720"/>
+        </w:tabs>
+        <w:ind w:left="720" w:hanging="360"/>
+      </w:pPr>
+    </w:lvl>
+    <w:lvl w:ilvl="1" w:tentative="1">
+      <w:start w:val="1"/>
+      <w:numFmt w:val="decimal"/>
+      <w:lvlText w:val="%2."/>
+      <w:lvlJc w:val="left"/>
+      <w:pPr>
+        <w:tabs>
+          <w:tab w:val="num" w:pos="1440"/>
+        </w:tabs>
+        <w:ind w:left="1440" w:hanging="360"/>
+      </w:pPr>
+    </w:lvl>
+    <w:lvl w:ilvl="2" w:tentative="1">
+      <w:start w:val="1"/>
+      <w:numFmt w:val="decimal"/>
+      <w:lvlText w:val="%3."/>
+      <w:lvlJc w:val="left"/>
+      <w:pPr>
+        <w:tabs>
+          <w:tab w:val="num" w:pos="2160"/>
+        </w:tabs>
+        <w:ind w:left="2160" w:hanging="360"/>
+      </w:pPr>
+    </w:lvl>
+    <w:lvl w:ilvl="3" w:tentative="1">
+      <w:start w:val="1"/>
+      <w:numFmt w:val="decimal"/>
+      <w:lvlText w:val="%4."/>
+      <w:lvlJc w:val="left"/>
+      <w:pPr>
+        <w:tabs>
+          <w:tab w:val="num" w:pos="2880"/>
+        </w:tabs>
+        <w:ind w:left="2880" w:hanging="360"/>
+      </w:pPr>
+    </w:lvl>
+    <w:lvl w:ilvl="4" w:tentative="1">
+      <w:start w:val="1"/>
+      <w:numFmt w:val="decimal"/>
+      <w:lvlText w:val="%5."/>
+      <w:lvlJc w:val="left"/>
+      <w:pPr>
+        <w:tabs>
+          <w:tab w:val="num" w:pos="3600"/>
+        </w:tabs>
+        <w:ind w:left="3600" w:hanging="360"/>
+      </w:pPr>
+    </w:lvl>
+    <w:lvl w:ilvl="5" w:tentative="1">
+      <w:start w:val="1"/>
+      <w:numFmt w:val="decimal"/>
+      <w:lvlText w:val="%6."/>
+      <w:lvlJc w:val="left"/>
+      <w:pPr>
+        <w:tabs>
+          <w:tab w:val="num" w:pos="4320"/>
+        </w:tabs>
+        <w:ind w:left="4320" w:hanging="360"/>
+      </w:pPr>
+    </w:lvl>
+    <w:lvl w:ilvl="6" w:tentative="1">
+      <w:start w:val="1"/>
+      <w:numFmt w:val="decimal"/>
+      <w:lvlText w:val="%7."/>
+      <w:lvlJc w:val="left"/>
+      <w:pPr>
+        <w:tabs>
+          <w:tab w:val="num" w:pos="5040"/>
+        </w:tabs>
+        <w:ind w:left="5040" w:hanging="360"/>
+      </w:pPr>
+    </w:lvl>
+    <w:lvl w:ilvl="7" w:tentative="1">
+      <w:start w:val="1"/>
+      <w:numFmt w:val="decimal"/>
+      <w:lvlText w:val="%8."/>
+      <w:lvlJc w:val="left"/>
+      <w:pPr>
+        <w:tabs>
+          <w:tab w:val="num" w:pos="5760"/>
+        </w:tabs>
+        <w:ind w:left="5760" w:hanging="360"/>
+      </w:pPr>
+    </w:lvl>
+    <w:lvl w:ilvl="8" w:tentative="1">
+      <w:start w:val="1"/>
+      <w:numFmt w:val="decimal"/>
+      <w:lvlText w:val="%9."/>
+      <w:lvlJc w:val="left"/>
+      <w:pPr>
+        <w:tabs>
+          <w:tab w:val="num" w:pos="6480"/>
+        </w:tabs>
+        <w:ind w:left="6480" w:hanging="360"/>
+      </w:pPr>
+    </w:lvl>
+  </w:abstractNum>
+  <w:abstractNum w:abstractNumId="7" w15:restartNumberingAfterBreak="0">
+    <w:nsid w:val="1EEB573D"/>
+    <w:multiLevelType w:val="multilevel"/>
+    <w:tmpl w:val="233CFD88"/>
+    <w:lvl w:ilvl="0">
+      <w:start w:val="1"/>
+      <w:numFmt w:val="bullet"/>
+      <w:lvlText w:val=""/>
+      <w:lvlJc w:val="left"/>
+      <w:pPr>
+        <w:tabs>
+          <w:tab w:val="num" w:pos="720"/>
+        </w:tabs>
+        <w:ind w:left="720" w:hanging="360"/>
+      </w:pPr>
+      <w:rPr>
+        <w:rFonts w:ascii="Symbol" w:hAnsi="Symbol" w:hint="default"/>
+        <w:sz w:val="20"/>
+      </w:rPr>
+    </w:lvl>
+    <w:lvl w:ilvl="1" w:tentative="1">
+      <w:start w:val="1"/>
+      <w:numFmt w:val="bullet"/>
+      <w:lvlText w:val="o"/>
+      <w:lvlJc w:val="left"/>
+      <w:pPr>
+        <w:tabs>
+          <w:tab w:val="num" w:pos="1440"/>
+        </w:tabs>
+        <w:ind w:left="1440" w:hanging="360"/>
+      </w:pPr>
+      <w:rPr>
+        <w:rFonts w:ascii="Courier New" w:hAnsi="Courier New" w:hint="default"/>
+        <w:sz w:val="20"/>
+      </w:rPr>
+    </w:lvl>
+    <w:lvl w:ilvl="2" w:tentative="1">
+      <w:start w:val="1"/>
+      <w:numFmt w:val="bullet"/>
+      <w:lvlText w:val=""/>
+      <w:lvlJc w:val="left"/>
+      <w:pPr>
+        <w:tabs>
+          <w:tab w:val="num" w:pos="2160"/>
+        </w:tabs>
+        <w:ind w:left="2160" w:hanging="360"/>
+      </w:pPr>
+      <w:rPr>
+        <w:rFonts w:ascii="Wingdings" w:hAnsi="Wingdings" w:hint="default"/>
+        <w:sz w:val="20"/>
+      </w:rPr>
+    </w:lvl>
+    <w:lvl w:ilvl="3" w:tentative="1">
+      <w:start w:val="1"/>
+      <w:numFmt w:val="bullet"/>
+      <w:lvlText w:val=""/>
+      <w:lvlJc w:val="left"/>
+      <w:pPr>
+        <w:tabs>
+          <w:tab w:val="num" w:pos="2880"/>
+        </w:tabs>
+        <w:ind w:left="2880" w:hanging="360"/>
+      </w:pPr>
+      <w:rPr>
+        <w:rFonts w:ascii="Wingdings" w:hAnsi="Wingdings" w:hint="default"/>
+        <w:sz w:val="20"/>
+      </w:rPr>
+    </w:lvl>
+    <w:lvl w:ilvl="4" w:tentative="1">
+      <w:start w:val="1"/>
+      <w:numFmt w:val="bullet"/>
+      <w:lvlText w:val=""/>
+      <w:lvlJc w:val="left"/>
+      <w:pPr>
+        <w:tabs>
+          <w:tab w:val="num" w:pos="3600"/>
+        </w:tabs>
+        <w:ind w:left="3600" w:hanging="360"/>
+      </w:pPr>
+      <w:rPr>
+        <w:rFonts w:ascii="Wingdings" w:hAnsi="Wingdings" w:hint="default"/>
+        <w:sz w:val="20"/>
+      </w:rPr>
+    </w:lvl>
+    <w:lvl w:ilvl="5" w:tentative="1">
+      <w:start w:val="1"/>
+      <w:numFmt w:val="bullet"/>
+      <w:lvlText w:val=""/>
+      <w:lvlJc w:val="left"/>
+      <w:pPr>
+        <w:tabs>
+          <w:tab w:val="num" w:pos="4320"/>
+        </w:tabs>
+        <w:ind w:left="4320" w:hanging="360"/>
+      </w:pPr>
+      <w:rPr>
+        <w:rFonts w:ascii="Wingdings" w:hAnsi="Wingdings" w:hint="default"/>
+        <w:sz w:val="20"/>
+      </w:rPr>
+    </w:lvl>
+    <w:lvl w:ilvl="6" w:tentative="1">
+      <w:start w:val="1"/>
+      <w:numFmt w:val="bullet"/>
+      <w:lvlText w:val=""/>
+      <w:lvlJc w:val="left"/>
+      <w:pPr>
+        <w:tabs>
+          <w:tab w:val="num" w:pos="5040"/>
+        </w:tabs>
+        <w:ind w:left="5040" w:hanging="360"/>
+      </w:pPr>
+      <w:rPr>
+        <w:rFonts w:ascii="Wingdings" w:hAnsi="Wingdings" w:hint="default"/>
+        <w:sz w:val="20"/>
+      </w:rPr>
+    </w:lvl>
+    <w:lvl w:ilvl="7" w:tentative="1">
+      <w:start w:val="1"/>
+      <w:numFmt w:val="bullet"/>
+      <w:lvlText w:val=""/>
+      <w:lvlJc w:val="left"/>
+      <w:pPr>
+        <w:tabs>
+          <w:tab w:val="num" w:pos="5760"/>
+        </w:tabs>
+        <w:ind w:left="5760" w:hanging="360"/>
+      </w:pPr>
+      <w:rPr>
+        <w:rFonts w:ascii="Wingdings" w:hAnsi="Wingdings" w:hint="default"/>
+        <w:sz w:val="20"/>
+      </w:rPr>
+    </w:lvl>
+    <w:lvl w:ilvl="8" w:tentative="1">
+      <w:start w:val="1"/>
+      <w:numFmt w:val="bullet"/>
+      <w:lvlText w:val=""/>
+      <w:lvlJc w:val="left"/>
+      <w:pPr>
+        <w:tabs>
+          <w:tab w:val="num" w:pos="6480"/>
+        </w:tabs>
+        <w:ind w:left="6480" w:hanging="360"/>
+      </w:pPr>
+      <w:rPr>
+        <w:rFonts w:ascii="Wingdings" w:hAnsi="Wingdings" w:hint="default"/>
+        <w:sz w:val="20"/>
+      </w:rPr>
+    </w:lvl>
+  </w:abstractNum>
+  <w:abstractNum w:abstractNumId="8" w15:restartNumberingAfterBreak="0">
     <w:nsid w:val="29445181"/>
     <w:multiLevelType w:val="multilevel"/>
     <w:tmpl w:val="03AC2D0E"/>
@@ -5069,7 +5573,7 @@
       </w:pPr>
     </w:lvl>
   </w:abstractNum>
-  <w:abstractNum w:abstractNumId="6" w15:restartNumberingAfterBreak="0">
+  <w:abstractNum w:abstractNumId="9" w15:restartNumberingAfterBreak="0">
     <w:nsid w:val="2A3E3E09"/>
     <w:multiLevelType w:val="hybridMultilevel"/>
     <w:tmpl w:val="22348404"/>
@@ -5159,7 +5663,7 @@
       </w:pPr>
     </w:lvl>
   </w:abstractNum>
-  <w:abstractNum w:abstractNumId="7" w15:restartNumberingAfterBreak="0">
+  <w:abstractNum w:abstractNumId="10" w15:restartNumberingAfterBreak="0">
     <w:nsid w:val="2A6A6593"/>
     <w:multiLevelType w:val="multilevel"/>
     <w:tmpl w:val="2716EDC0"/>
@@ -5272,7 +5776,7 @@
       </w:pPr>
     </w:lvl>
   </w:abstractNum>
-  <w:abstractNum w:abstractNumId="8" w15:restartNumberingAfterBreak="0">
+  <w:abstractNum w:abstractNumId="11" w15:restartNumberingAfterBreak="0">
     <w:nsid w:val="2C4C10C5"/>
     <w:multiLevelType w:val="multilevel"/>
     <w:tmpl w:val="2E6E9774"/>
@@ -5421,7 +5925,120 @@
       </w:rPr>
     </w:lvl>
   </w:abstractNum>
-  <w:abstractNum w:abstractNumId="9" w15:restartNumberingAfterBreak="0">
+  <w:abstractNum w:abstractNumId="12" w15:restartNumberingAfterBreak="0">
+    <w:nsid w:val="2C4F0704"/>
+    <w:multiLevelType w:val="multilevel"/>
+    <w:tmpl w:val="C8001FEE"/>
+    <w:lvl w:ilvl="0">
+      <w:start w:val="1"/>
+      <w:numFmt w:val="decimal"/>
+      <w:lvlText w:val="%1."/>
+      <w:lvlJc w:val="left"/>
+      <w:pPr>
+        <w:tabs>
+          <w:tab w:val="num" w:pos="720"/>
+        </w:tabs>
+        <w:ind w:left="720" w:hanging="360"/>
+      </w:pPr>
+    </w:lvl>
+    <w:lvl w:ilvl="1" w:tentative="1">
+      <w:start w:val="1"/>
+      <w:numFmt w:val="decimal"/>
+      <w:lvlText w:val="%2."/>
+      <w:lvlJc w:val="left"/>
+      <w:pPr>
+        <w:tabs>
+          <w:tab w:val="num" w:pos="1440"/>
+        </w:tabs>
+        <w:ind w:left="1440" w:hanging="360"/>
+      </w:pPr>
+    </w:lvl>
+    <w:lvl w:ilvl="2" w:tentative="1">
+      <w:start w:val="1"/>
+      <w:numFmt w:val="decimal"/>
+      <w:lvlText w:val="%3."/>
+      <w:lvlJc w:val="left"/>
+      <w:pPr>
+        <w:tabs>
+          <w:tab w:val="num" w:pos="2160"/>
+        </w:tabs>
+        <w:ind w:left="2160" w:hanging="360"/>
+      </w:pPr>
+    </w:lvl>
+    <w:lvl w:ilvl="3" w:tentative="1">
+      <w:start w:val="1"/>
+      <w:numFmt w:val="decimal"/>
+      <w:lvlText w:val="%4."/>
+      <w:lvlJc w:val="left"/>
+      <w:pPr>
+        <w:tabs>
+          <w:tab w:val="num" w:pos="2880"/>
+        </w:tabs>
+        <w:ind w:left="2880" w:hanging="360"/>
+      </w:pPr>
+    </w:lvl>
+    <w:lvl w:ilvl="4" w:tentative="1">
+      <w:start w:val="1"/>
+      <w:numFmt w:val="decimal"/>
+      <w:lvlText w:val="%5."/>
+      <w:lvlJc w:val="left"/>
+      <w:pPr>
+        <w:tabs>
+          <w:tab w:val="num" w:pos="3600"/>
+        </w:tabs>
+        <w:ind w:left="3600" w:hanging="360"/>
+      </w:pPr>
+    </w:lvl>
+    <w:lvl w:ilvl="5" w:tentative="1">
+      <w:start w:val="1"/>
+      <w:numFmt w:val="decimal"/>
+      <w:lvlText w:val="%6."/>
+      <w:lvlJc w:val="left"/>
+      <w:pPr>
+        <w:tabs>
+          <w:tab w:val="num" w:pos="4320"/>
+        </w:tabs>
+        <w:ind w:left="4320" w:hanging="360"/>
+      </w:pPr>
+    </w:lvl>
+    <w:lvl w:ilvl="6" w:tentative="1">
+      <w:start w:val="1"/>
+      <w:numFmt w:val="decimal"/>
+      <w:lvlText w:val="%7."/>
+      <w:lvlJc w:val="left"/>
+      <w:pPr>
+        <w:tabs>
+          <w:tab w:val="num" w:pos="5040"/>
+        </w:tabs>
+        <w:ind w:left="5040" w:hanging="360"/>
+      </w:pPr>
+    </w:lvl>
+    <w:lvl w:ilvl="7" w:tentative="1">
+      <w:start w:val="1"/>
+      <w:numFmt w:val="decimal"/>
+      <w:lvlText w:val="%8."/>
+      <w:lvlJc w:val="left"/>
+      <w:pPr>
+        <w:tabs>
+          <w:tab w:val="num" w:pos="5760"/>
+        </w:tabs>
+        <w:ind w:left="5760" w:hanging="360"/>
+      </w:pPr>
+    </w:lvl>
+    <w:lvl w:ilvl="8" w:tentative="1">
+      <w:start w:val="1"/>
+      <w:numFmt w:val="decimal"/>
+      <w:lvlText w:val="%9."/>
+      <w:lvlJc w:val="left"/>
+      <w:pPr>
+        <w:tabs>
+          <w:tab w:val="num" w:pos="6480"/>
+        </w:tabs>
+        <w:ind w:left="6480" w:hanging="360"/>
+      </w:pPr>
+    </w:lvl>
+  </w:abstractNum>
+  <w:abstractNum w:abstractNumId="13" w15:restartNumberingAfterBreak="0">
     <w:nsid w:val="2D2105E6"/>
     <w:multiLevelType w:val="multilevel"/>
     <w:tmpl w:val="DCB82134"/>
@@ -5570,7 +6187,7 @@
       </w:rPr>
     </w:lvl>
   </w:abstractNum>
-  <w:abstractNum w:abstractNumId="10" w15:restartNumberingAfterBreak="0">
+  <w:abstractNum w:abstractNumId="14" w15:restartNumberingAfterBreak="0">
     <w:nsid w:val="303766CB"/>
     <w:multiLevelType w:val="multilevel"/>
     <w:tmpl w:val="93883B36"/>
@@ -5719,7 +6336,567 @@
       </w:rPr>
     </w:lvl>
   </w:abstractNum>
-  <w:abstractNum w:abstractNumId="11" w15:restartNumberingAfterBreak="0">
+  <w:abstractNum w:abstractNumId="15" w15:restartNumberingAfterBreak="0">
+    <w:nsid w:val="304759CF"/>
+    <w:multiLevelType w:val="multilevel"/>
+    <w:tmpl w:val="3AECE598"/>
+    <w:lvl w:ilvl="0">
+      <w:start w:val="1"/>
+      <w:numFmt w:val="bullet"/>
+      <w:lvlText w:val=""/>
+      <w:lvlJc w:val="left"/>
+      <w:pPr>
+        <w:tabs>
+          <w:tab w:val="num" w:pos="720"/>
+        </w:tabs>
+        <w:ind w:left="720" w:hanging="360"/>
+      </w:pPr>
+      <w:rPr>
+        <w:rFonts w:ascii="Symbol" w:hAnsi="Symbol" w:hint="default"/>
+        <w:sz w:val="20"/>
+      </w:rPr>
+    </w:lvl>
+    <w:lvl w:ilvl="1" w:tentative="1">
+      <w:start w:val="1"/>
+      <w:numFmt w:val="bullet"/>
+      <w:lvlText w:val="o"/>
+      <w:lvlJc w:val="left"/>
+      <w:pPr>
+        <w:tabs>
+          <w:tab w:val="num" w:pos="1440"/>
+        </w:tabs>
+        <w:ind w:left="1440" w:hanging="360"/>
+      </w:pPr>
+      <w:rPr>
+        <w:rFonts w:ascii="Courier New" w:hAnsi="Courier New" w:hint="default"/>
+        <w:sz w:val="20"/>
+      </w:rPr>
+    </w:lvl>
+    <w:lvl w:ilvl="2" w:tentative="1">
+      <w:start w:val="1"/>
+      <w:numFmt w:val="bullet"/>
+      <w:lvlText w:val=""/>
+      <w:lvlJc w:val="left"/>
+      <w:pPr>
+        <w:tabs>
+          <w:tab w:val="num" w:pos="2160"/>
+        </w:tabs>
+        <w:ind w:left="2160" w:hanging="360"/>
+      </w:pPr>
+      <w:rPr>
+        <w:rFonts w:ascii="Wingdings" w:hAnsi="Wingdings" w:hint="default"/>
+        <w:sz w:val="20"/>
+      </w:rPr>
+    </w:lvl>
+    <w:lvl w:ilvl="3" w:tentative="1">
+      <w:start w:val="1"/>
+      <w:numFmt w:val="bullet"/>
+      <w:lvlText w:val=""/>
+      <w:lvlJc w:val="left"/>
+      <w:pPr>
+        <w:tabs>
+          <w:tab w:val="num" w:pos="2880"/>
+        </w:tabs>
+        <w:ind w:left="2880" w:hanging="360"/>
+      </w:pPr>
+      <w:rPr>
+        <w:rFonts w:ascii="Wingdings" w:hAnsi="Wingdings" w:hint="default"/>
+        <w:sz w:val="20"/>
+      </w:rPr>
+    </w:lvl>
+    <w:lvl w:ilvl="4" w:tentative="1">
+      <w:start w:val="1"/>
+      <w:numFmt w:val="bullet"/>
+      <w:lvlText w:val=""/>
+      <w:lvlJc w:val="left"/>
+      <w:pPr>
+        <w:tabs>
+          <w:tab w:val="num" w:pos="3600"/>
+        </w:tabs>
+        <w:ind w:left="3600" w:hanging="360"/>
+      </w:pPr>
+      <w:rPr>
+        <w:rFonts w:ascii="Wingdings" w:hAnsi="Wingdings" w:hint="default"/>
+        <w:sz w:val="20"/>
+      </w:rPr>
+    </w:lvl>
+    <w:lvl w:ilvl="5" w:tentative="1">
+      <w:start w:val="1"/>
+      <w:numFmt w:val="bullet"/>
+      <w:lvlText w:val=""/>
+      <w:lvlJc w:val="left"/>
+      <w:pPr>
+        <w:tabs>
+          <w:tab w:val="num" w:pos="4320"/>
+        </w:tabs>
+        <w:ind w:left="4320" w:hanging="360"/>
+      </w:pPr>
+      <w:rPr>
+        <w:rFonts w:ascii="Wingdings" w:hAnsi="Wingdings" w:hint="default"/>
+        <w:sz w:val="20"/>
+      </w:rPr>
+    </w:lvl>
+    <w:lvl w:ilvl="6" w:tentative="1">
+      <w:start w:val="1"/>
+      <w:numFmt w:val="bullet"/>
+      <w:lvlText w:val=""/>
+      <w:lvlJc w:val="left"/>
+      <w:pPr>
+        <w:tabs>
+          <w:tab w:val="num" w:pos="5040"/>
+        </w:tabs>
+        <w:ind w:left="5040" w:hanging="360"/>
+      </w:pPr>
+      <w:rPr>
+        <w:rFonts w:ascii="Wingdings" w:hAnsi="Wingdings" w:hint="default"/>
+        <w:sz w:val="20"/>
+      </w:rPr>
+    </w:lvl>
+    <w:lvl w:ilvl="7" w:tentative="1">
+      <w:start w:val="1"/>
+      <w:numFmt w:val="bullet"/>
+      <w:lvlText w:val=""/>
+      <w:lvlJc w:val="left"/>
+      <w:pPr>
+        <w:tabs>
+          <w:tab w:val="num" w:pos="5760"/>
+        </w:tabs>
+        <w:ind w:left="5760" w:hanging="360"/>
+      </w:pPr>
+      <w:rPr>
+        <w:rFonts w:ascii="Wingdings" w:hAnsi="Wingdings" w:hint="default"/>
+        <w:sz w:val="20"/>
+      </w:rPr>
+    </w:lvl>
+    <w:lvl w:ilvl="8" w:tentative="1">
+      <w:start w:val="1"/>
+      <w:numFmt w:val="bullet"/>
+      <w:lvlText w:val=""/>
+      <w:lvlJc w:val="left"/>
+      <w:pPr>
+        <w:tabs>
+          <w:tab w:val="num" w:pos="6480"/>
+        </w:tabs>
+        <w:ind w:left="6480" w:hanging="360"/>
+      </w:pPr>
+      <w:rPr>
+        <w:rFonts w:ascii="Wingdings" w:hAnsi="Wingdings" w:hint="default"/>
+        <w:sz w:val="20"/>
+      </w:rPr>
+    </w:lvl>
+  </w:abstractNum>
+  <w:abstractNum w:abstractNumId="16" w15:restartNumberingAfterBreak="0">
+    <w:nsid w:val="32D70C94"/>
+    <w:multiLevelType w:val="multilevel"/>
+    <w:tmpl w:val="52944F04"/>
+    <w:lvl w:ilvl="0">
+      <w:start w:val="1"/>
+      <w:numFmt w:val="bullet"/>
+      <w:lvlText w:val=""/>
+      <w:lvlJc w:val="left"/>
+      <w:pPr>
+        <w:tabs>
+          <w:tab w:val="num" w:pos="720"/>
+        </w:tabs>
+        <w:ind w:left="720" w:hanging="360"/>
+      </w:pPr>
+      <w:rPr>
+        <w:rFonts w:ascii="Symbol" w:hAnsi="Symbol" w:hint="default"/>
+        <w:sz w:val="20"/>
+      </w:rPr>
+    </w:lvl>
+    <w:lvl w:ilvl="1" w:tentative="1">
+      <w:start w:val="1"/>
+      <w:numFmt w:val="bullet"/>
+      <w:lvlText w:val="o"/>
+      <w:lvlJc w:val="left"/>
+      <w:pPr>
+        <w:tabs>
+          <w:tab w:val="num" w:pos="1440"/>
+        </w:tabs>
+        <w:ind w:left="1440" w:hanging="360"/>
+      </w:pPr>
+      <w:rPr>
+        <w:rFonts w:ascii="Courier New" w:hAnsi="Courier New" w:hint="default"/>
+        <w:sz w:val="20"/>
+      </w:rPr>
+    </w:lvl>
+    <w:lvl w:ilvl="2" w:tentative="1">
+      <w:start w:val="1"/>
+      <w:numFmt w:val="bullet"/>
+      <w:lvlText w:val=""/>
+      <w:lvlJc w:val="left"/>
+      <w:pPr>
+        <w:tabs>
+          <w:tab w:val="num" w:pos="2160"/>
+        </w:tabs>
+        <w:ind w:left="2160" w:hanging="360"/>
+      </w:pPr>
+      <w:rPr>
+        <w:rFonts w:ascii="Wingdings" w:hAnsi="Wingdings" w:hint="default"/>
+        <w:sz w:val="20"/>
+      </w:rPr>
+    </w:lvl>
+    <w:lvl w:ilvl="3" w:tentative="1">
+      <w:start w:val="1"/>
+      <w:numFmt w:val="bullet"/>
+      <w:lvlText w:val=""/>
+      <w:lvlJc w:val="left"/>
+      <w:pPr>
+        <w:tabs>
+          <w:tab w:val="num" w:pos="2880"/>
+        </w:tabs>
+        <w:ind w:left="2880" w:hanging="360"/>
+      </w:pPr>
+      <w:rPr>
+        <w:rFonts w:ascii="Wingdings" w:hAnsi="Wingdings" w:hint="default"/>
+        <w:sz w:val="20"/>
+      </w:rPr>
+    </w:lvl>
+    <w:lvl w:ilvl="4" w:tentative="1">
+      <w:start w:val="1"/>
+      <w:numFmt w:val="bullet"/>
+      <w:lvlText w:val=""/>
+      <w:lvlJc w:val="left"/>
+      <w:pPr>
+        <w:tabs>
+          <w:tab w:val="num" w:pos="3600"/>
+        </w:tabs>
+        <w:ind w:left="3600" w:hanging="360"/>
+      </w:pPr>
+      <w:rPr>
+        <w:rFonts w:ascii="Wingdings" w:hAnsi="Wingdings" w:hint="default"/>
+        <w:sz w:val="20"/>
+      </w:rPr>
+    </w:lvl>
+    <w:lvl w:ilvl="5" w:tentative="1">
+      <w:start w:val="1"/>
+      <w:numFmt w:val="bullet"/>
+      <w:lvlText w:val=""/>
+      <w:lvlJc w:val="left"/>
+      <w:pPr>
+        <w:tabs>
+          <w:tab w:val="num" w:pos="4320"/>
+        </w:tabs>
+        <w:ind w:left="4320" w:hanging="360"/>
+      </w:pPr>
+      <w:rPr>
+        <w:rFonts w:ascii="Wingdings" w:hAnsi="Wingdings" w:hint="default"/>
+        <w:sz w:val="20"/>
+      </w:rPr>
+    </w:lvl>
+    <w:lvl w:ilvl="6" w:tentative="1">
+      <w:start w:val="1"/>
+      <w:numFmt w:val="bullet"/>
+      <w:lvlText w:val=""/>
+      <w:lvlJc w:val="left"/>
+      <w:pPr>
+        <w:tabs>
+          <w:tab w:val="num" w:pos="5040"/>
+        </w:tabs>
+        <w:ind w:left="5040" w:hanging="360"/>
+      </w:pPr>
+      <w:rPr>
+        <w:rFonts w:ascii="Wingdings" w:hAnsi="Wingdings" w:hint="default"/>
+        <w:sz w:val="20"/>
+      </w:rPr>
+    </w:lvl>
+    <w:lvl w:ilvl="7" w:tentative="1">
+      <w:start w:val="1"/>
+      <w:numFmt w:val="bullet"/>
+      <w:lvlText w:val=""/>
+      <w:lvlJc w:val="left"/>
+      <w:pPr>
+        <w:tabs>
+          <w:tab w:val="num" w:pos="5760"/>
+        </w:tabs>
+        <w:ind w:left="5760" w:hanging="360"/>
+      </w:pPr>
+      <w:rPr>
+        <w:rFonts w:ascii="Wingdings" w:hAnsi="Wingdings" w:hint="default"/>
+        <w:sz w:val="20"/>
+      </w:rPr>
+    </w:lvl>
+    <w:lvl w:ilvl="8" w:tentative="1">
+      <w:start w:val="1"/>
+      <w:numFmt w:val="bullet"/>
+      <w:lvlText w:val=""/>
+      <w:lvlJc w:val="left"/>
+      <w:pPr>
+        <w:tabs>
+          <w:tab w:val="num" w:pos="6480"/>
+        </w:tabs>
+        <w:ind w:left="6480" w:hanging="360"/>
+      </w:pPr>
+      <w:rPr>
+        <w:rFonts w:ascii="Wingdings" w:hAnsi="Wingdings" w:hint="default"/>
+        <w:sz w:val="20"/>
+      </w:rPr>
+    </w:lvl>
+  </w:abstractNum>
+  <w:abstractNum w:abstractNumId="17" w15:restartNumberingAfterBreak="0">
+    <w:nsid w:val="3D1A5BDF"/>
+    <w:multiLevelType w:val="multilevel"/>
+    <w:tmpl w:val="A8009BBC"/>
+    <w:lvl w:ilvl="0">
+      <w:start w:val="1"/>
+      <w:numFmt w:val="decimal"/>
+      <w:lvlText w:val="%1."/>
+      <w:lvlJc w:val="left"/>
+      <w:pPr>
+        <w:tabs>
+          <w:tab w:val="num" w:pos="720"/>
+        </w:tabs>
+        <w:ind w:left="720" w:hanging="360"/>
+      </w:pPr>
+    </w:lvl>
+    <w:lvl w:ilvl="1" w:tentative="1">
+      <w:start w:val="1"/>
+      <w:numFmt w:val="decimal"/>
+      <w:lvlText w:val="%2."/>
+      <w:lvlJc w:val="left"/>
+      <w:pPr>
+        <w:tabs>
+          <w:tab w:val="num" w:pos="1440"/>
+        </w:tabs>
+        <w:ind w:left="1440" w:hanging="360"/>
+      </w:pPr>
+    </w:lvl>
+    <w:lvl w:ilvl="2" w:tentative="1">
+      <w:start w:val="1"/>
+      <w:numFmt w:val="decimal"/>
+      <w:lvlText w:val="%3."/>
+      <w:lvlJc w:val="left"/>
+      <w:pPr>
+        <w:tabs>
+          <w:tab w:val="num" w:pos="2160"/>
+        </w:tabs>
+        <w:ind w:left="2160" w:hanging="360"/>
+      </w:pPr>
+    </w:lvl>
+    <w:lvl w:ilvl="3" w:tentative="1">
+      <w:start w:val="1"/>
+      <w:numFmt w:val="decimal"/>
+      <w:lvlText w:val="%4."/>
+      <w:lvlJc w:val="left"/>
+      <w:pPr>
+        <w:tabs>
+          <w:tab w:val="num" w:pos="2880"/>
+        </w:tabs>
+        <w:ind w:left="2880" w:hanging="360"/>
+      </w:pPr>
+    </w:lvl>
+    <w:lvl w:ilvl="4" w:tentative="1">
+      <w:start w:val="1"/>
+      <w:numFmt w:val="decimal"/>
+      <w:lvlText w:val="%5."/>
+      <w:lvlJc w:val="left"/>
+      <w:pPr>
+        <w:tabs>
+          <w:tab w:val="num" w:pos="3600"/>
+        </w:tabs>
+        <w:ind w:left="3600" w:hanging="360"/>
+      </w:pPr>
+    </w:lvl>
+    <w:lvl w:ilvl="5" w:tentative="1">
+      <w:start w:val="1"/>
+      <w:numFmt w:val="decimal"/>
+      <w:lvlText w:val="%6."/>
+      <w:lvlJc w:val="left"/>
+      <w:pPr>
+        <w:tabs>
+          <w:tab w:val="num" w:pos="4320"/>
+        </w:tabs>
+        <w:ind w:left="4320" w:hanging="360"/>
+      </w:pPr>
+    </w:lvl>
+    <w:lvl w:ilvl="6" w:tentative="1">
+      <w:start w:val="1"/>
+      <w:numFmt w:val="decimal"/>
+      <w:lvlText w:val="%7."/>
+      <w:lvlJc w:val="left"/>
+      <w:pPr>
+        <w:tabs>
+          <w:tab w:val="num" w:pos="5040"/>
+        </w:tabs>
+        <w:ind w:left="5040" w:hanging="360"/>
+      </w:pPr>
+    </w:lvl>
+    <w:lvl w:ilvl="7" w:tentative="1">
+      <w:start w:val="1"/>
+      <w:numFmt w:val="decimal"/>
+      <w:lvlText w:val="%8."/>
+      <w:lvlJc w:val="left"/>
+      <w:pPr>
+        <w:tabs>
+          <w:tab w:val="num" w:pos="5760"/>
+        </w:tabs>
+        <w:ind w:left="5760" w:hanging="360"/>
+      </w:pPr>
+    </w:lvl>
+    <w:lvl w:ilvl="8" w:tentative="1">
+      <w:start w:val="1"/>
+      <w:numFmt w:val="decimal"/>
+      <w:lvlText w:val="%9."/>
+      <w:lvlJc w:val="left"/>
+      <w:pPr>
+        <w:tabs>
+          <w:tab w:val="num" w:pos="6480"/>
+        </w:tabs>
+        <w:ind w:left="6480" w:hanging="360"/>
+      </w:pPr>
+    </w:lvl>
+  </w:abstractNum>
+  <w:abstractNum w:abstractNumId="18" w15:restartNumberingAfterBreak="0">
+    <w:nsid w:val="3D38453B"/>
+    <w:multiLevelType w:val="multilevel"/>
+    <w:tmpl w:val="393E6A22"/>
+    <w:lvl w:ilvl="0">
+      <w:start w:val="1"/>
+      <w:numFmt w:val="bullet"/>
+      <w:lvlText w:val=""/>
+      <w:lvlJc w:val="left"/>
+      <w:pPr>
+        <w:tabs>
+          <w:tab w:val="num" w:pos="720"/>
+        </w:tabs>
+        <w:ind w:left="720" w:hanging="360"/>
+      </w:pPr>
+      <w:rPr>
+        <w:rFonts w:ascii="Symbol" w:hAnsi="Symbol" w:hint="default"/>
+        <w:sz w:val="20"/>
+      </w:rPr>
+    </w:lvl>
+    <w:lvl w:ilvl="1" w:tentative="1">
+      <w:start w:val="1"/>
+      <w:numFmt w:val="bullet"/>
+      <w:lvlText w:val="o"/>
+      <w:lvlJc w:val="left"/>
+      <w:pPr>
+        <w:tabs>
+          <w:tab w:val="num" w:pos="1440"/>
+        </w:tabs>
+        <w:ind w:left="1440" w:hanging="360"/>
+      </w:pPr>
+      <w:rPr>
+        <w:rFonts w:ascii="Courier New" w:hAnsi="Courier New" w:hint="default"/>
+        <w:sz w:val="20"/>
+      </w:rPr>
+    </w:lvl>
+    <w:lvl w:ilvl="2" w:tentative="1">
+      <w:start w:val="1"/>
+      <w:numFmt w:val="bullet"/>
+      <w:lvlText w:val=""/>
+      <w:lvlJc w:val="left"/>
+      <w:pPr>
+        <w:tabs>
+          <w:tab w:val="num" w:pos="2160"/>
+        </w:tabs>
+        <w:ind w:left="2160" w:hanging="360"/>
+      </w:pPr>
+      <w:rPr>
+        <w:rFonts w:ascii="Wingdings" w:hAnsi="Wingdings" w:hint="default"/>
+        <w:sz w:val="20"/>
+      </w:rPr>
+    </w:lvl>
+    <w:lvl w:ilvl="3" w:tentative="1">
+      <w:start w:val="1"/>
+      <w:numFmt w:val="bullet"/>
+      <w:lvlText w:val=""/>
+      <w:lvlJc w:val="left"/>
+      <w:pPr>
+        <w:tabs>
+          <w:tab w:val="num" w:pos="2880"/>
+        </w:tabs>
+        <w:ind w:left="2880" w:hanging="360"/>
+      </w:pPr>
+      <w:rPr>
+        <w:rFonts w:ascii="Wingdings" w:hAnsi="Wingdings" w:hint="default"/>
+        <w:sz w:val="20"/>
+      </w:rPr>
+    </w:lvl>
+    <w:lvl w:ilvl="4" w:tentative="1">
+      <w:start w:val="1"/>
+      <w:numFmt w:val="bullet"/>
+      <w:lvlText w:val=""/>
+      <w:lvlJc w:val="left"/>
+      <w:pPr>
+        <w:tabs>
+          <w:tab w:val="num" w:pos="3600"/>
+        </w:tabs>
+        <w:ind w:left="3600" w:hanging="360"/>
+      </w:pPr>
+      <w:rPr>
+        <w:rFonts w:ascii="Wingdings" w:hAnsi="Wingdings" w:hint="default"/>
+        <w:sz w:val="20"/>
+      </w:rPr>
+    </w:lvl>
+    <w:lvl w:ilvl="5" w:tentative="1">
+      <w:start w:val="1"/>
+      <w:numFmt w:val="bullet"/>
+      <w:lvlText w:val=""/>
+      <w:lvlJc w:val="left"/>
+      <w:pPr>
+        <w:tabs>
+          <w:tab w:val="num" w:pos="4320"/>
+        </w:tabs>
+        <w:ind w:left="4320" w:hanging="360"/>
+      </w:pPr>
+      <w:rPr>
+        <w:rFonts w:ascii="Wingdings" w:hAnsi="Wingdings" w:hint="default"/>
+        <w:sz w:val="20"/>
+      </w:rPr>
+    </w:lvl>
+    <w:lvl w:ilvl="6" w:tentative="1">
+      <w:start w:val="1"/>
+      <w:numFmt w:val="bullet"/>
+      <w:lvlText w:val=""/>
+      <w:lvlJc w:val="left"/>
+      <w:pPr>
+        <w:tabs>
+          <w:tab w:val="num" w:pos="5040"/>
+        </w:tabs>
+        <w:ind w:left="5040" w:hanging="360"/>
+      </w:pPr>
+      <w:rPr>
+        <w:rFonts w:ascii="Wingdings" w:hAnsi="Wingdings" w:hint="default"/>
+        <w:sz w:val="20"/>
+      </w:rPr>
+    </w:lvl>
+    <w:lvl w:ilvl="7" w:tentative="1">
+      <w:start w:val="1"/>
+      <w:numFmt w:val="bullet"/>
+      <w:lvlText w:val=""/>
+      <w:lvlJc w:val="left"/>
+      <w:pPr>
+        <w:tabs>
+          <w:tab w:val="num" w:pos="5760"/>
+        </w:tabs>
+        <w:ind w:left="5760" w:hanging="360"/>
+      </w:pPr>
+      <w:rPr>
+        <w:rFonts w:ascii="Wingdings" w:hAnsi="Wingdings" w:hint="default"/>
+        <w:sz w:val="20"/>
+      </w:rPr>
+    </w:lvl>
+    <w:lvl w:ilvl="8" w:tentative="1">
+      <w:start w:val="1"/>
+      <w:numFmt w:val="bullet"/>
+      <w:lvlText w:val=""/>
+      <w:lvlJc w:val="left"/>
+      <w:pPr>
+        <w:tabs>
+          <w:tab w:val="num" w:pos="6480"/>
+        </w:tabs>
+        <w:ind w:left="6480" w:hanging="360"/>
+      </w:pPr>
+      <w:rPr>
+        <w:rFonts w:ascii="Wingdings" w:hAnsi="Wingdings" w:hint="default"/>
+        <w:sz w:val="20"/>
+      </w:rPr>
+    </w:lvl>
+  </w:abstractNum>
+  <w:abstractNum w:abstractNumId="19" w15:restartNumberingAfterBreak="0">
     <w:nsid w:val="43AD75C7"/>
     <w:multiLevelType w:val="multilevel"/>
     <w:tmpl w:val="414C7F34"/>
@@ -5868,7 +7045,7 @@
       </w:rPr>
     </w:lvl>
   </w:abstractNum>
-  <w:abstractNum w:abstractNumId="12" w15:restartNumberingAfterBreak="0">
+  <w:abstractNum w:abstractNumId="20" w15:restartNumberingAfterBreak="0">
     <w:nsid w:val="45BF0310"/>
     <w:multiLevelType w:val="multilevel"/>
     <w:tmpl w:val="672EE142"/>
@@ -6017,7 +7194,7 @@
       </w:rPr>
     </w:lvl>
   </w:abstractNum>
-  <w:abstractNum w:abstractNumId="13" w15:restartNumberingAfterBreak="0">
+  <w:abstractNum w:abstractNumId="21" w15:restartNumberingAfterBreak="0">
     <w:nsid w:val="4E195729"/>
     <w:multiLevelType w:val="multilevel"/>
     <w:tmpl w:val="286E6964"/>
@@ -6166,7 +7343,7 @@
       </w:rPr>
     </w:lvl>
   </w:abstractNum>
-  <w:abstractNum w:abstractNumId="14" w15:restartNumberingAfterBreak="0">
+  <w:abstractNum w:abstractNumId="22" w15:restartNumberingAfterBreak="0">
     <w:nsid w:val="4F181E59"/>
     <w:multiLevelType w:val="multilevel"/>
     <w:tmpl w:val="ED58CB4C"/>
@@ -6315,7 +7492,7 @@
       </w:rPr>
     </w:lvl>
   </w:abstractNum>
-  <w:abstractNum w:abstractNumId="15" w15:restartNumberingAfterBreak="0">
+  <w:abstractNum w:abstractNumId="23" w15:restartNumberingAfterBreak="0">
     <w:nsid w:val="56210032"/>
     <w:multiLevelType w:val="multilevel"/>
     <w:tmpl w:val="36A01520"/>
@@ -6464,7 +7641,7 @@
       </w:rPr>
     </w:lvl>
   </w:abstractNum>
-  <w:abstractNum w:abstractNumId="16" w15:restartNumberingAfterBreak="0">
+  <w:abstractNum w:abstractNumId="24" w15:restartNumberingAfterBreak="0">
     <w:nsid w:val="5EEF3755"/>
     <w:multiLevelType w:val="hybridMultilevel"/>
     <w:tmpl w:val="34ECA9AC"/>
@@ -6554,7 +7731,7 @@
       </w:pPr>
     </w:lvl>
   </w:abstractNum>
-  <w:abstractNum w:abstractNumId="17" w15:restartNumberingAfterBreak="0">
+  <w:abstractNum w:abstractNumId="25" w15:restartNumberingAfterBreak="0">
     <w:nsid w:val="6465304A"/>
     <w:multiLevelType w:val="hybridMultilevel"/>
     <w:tmpl w:val="603E983A"/>
@@ -6643,7 +7820,7 @@
       </w:pPr>
     </w:lvl>
   </w:abstractNum>
-  <w:abstractNum w:abstractNumId="18" w15:restartNumberingAfterBreak="0">
+  <w:abstractNum w:abstractNumId="26" w15:restartNumberingAfterBreak="0">
     <w:nsid w:val="68B65B33"/>
     <w:multiLevelType w:val="hybridMultilevel"/>
     <w:tmpl w:val="F41EBD72"/>
@@ -6732,7 +7909,7 @@
       </w:pPr>
     </w:lvl>
   </w:abstractNum>
-  <w:abstractNum w:abstractNumId="19" w15:restartNumberingAfterBreak="0">
+  <w:abstractNum w:abstractNumId="27" w15:restartNumberingAfterBreak="0">
     <w:nsid w:val="6F33480E"/>
     <w:multiLevelType w:val="multilevel"/>
     <w:tmpl w:val="F502E362"/>
@@ -6881,7 +8058,7 @@
       </w:rPr>
     </w:lvl>
   </w:abstractNum>
-  <w:abstractNum w:abstractNumId="20" w15:restartNumberingAfterBreak="0">
+  <w:abstractNum w:abstractNumId="28" w15:restartNumberingAfterBreak="0">
     <w:nsid w:val="72CA7413"/>
     <w:multiLevelType w:val="multilevel"/>
     <w:tmpl w:val="9BDE38EA"/>
@@ -7030,7 +8207,7 @@
       </w:rPr>
     </w:lvl>
   </w:abstractNum>
-  <w:abstractNum w:abstractNumId="21" w15:restartNumberingAfterBreak="0">
+  <w:abstractNum w:abstractNumId="29" w15:restartNumberingAfterBreak="0">
     <w:nsid w:val="76D17050"/>
     <w:multiLevelType w:val="hybridMultilevel"/>
     <w:tmpl w:val="B57CF91E"/>
@@ -7119,7 +8296,7 @@
       </w:pPr>
     </w:lvl>
   </w:abstractNum>
-  <w:abstractNum w:abstractNumId="22" w15:restartNumberingAfterBreak="0">
+  <w:abstractNum w:abstractNumId="30" w15:restartNumberingAfterBreak="0">
     <w:nsid w:val="76FA2C6C"/>
     <w:multiLevelType w:val="multilevel"/>
     <w:tmpl w:val="B1C43874"/>
@@ -7268,7 +8445,7 @@
       </w:rPr>
     </w:lvl>
   </w:abstractNum>
-  <w:abstractNum w:abstractNumId="23" w15:restartNumberingAfterBreak="0">
+  <w:abstractNum w:abstractNumId="31" w15:restartNumberingAfterBreak="0">
     <w:nsid w:val="777E607B"/>
     <w:multiLevelType w:val="multilevel"/>
     <w:tmpl w:val="2BB4FC14"/>
@@ -7417,7 +8594,7 @@
       </w:rPr>
     </w:lvl>
   </w:abstractNum>
-  <w:abstractNum w:abstractNumId="24" w15:restartNumberingAfterBreak="0">
+  <w:abstractNum w:abstractNumId="32" w15:restartNumberingAfterBreak="0">
     <w:nsid w:val="78A52F8B"/>
     <w:multiLevelType w:val="multilevel"/>
     <w:tmpl w:val="4A0AF9EC"/>
@@ -7566,7 +8743,7 @@
       </w:rPr>
     </w:lvl>
   </w:abstractNum>
-  <w:abstractNum w:abstractNumId="25" w15:restartNumberingAfterBreak="0">
+  <w:abstractNum w:abstractNumId="33" w15:restartNumberingAfterBreak="0">
     <w:nsid w:val="7A5E4613"/>
     <w:multiLevelType w:val="hybridMultilevel"/>
     <w:tmpl w:val="125009D0"/>
@@ -7678,7 +8855,7 @@
       </w:rPr>
     </w:lvl>
   </w:abstractNum>
-  <w:abstractNum w:abstractNumId="26" w15:restartNumberingAfterBreak="0">
+  <w:abstractNum w:abstractNumId="34" w15:restartNumberingAfterBreak="0">
     <w:nsid w:val="7B8021D7"/>
     <w:multiLevelType w:val="multilevel"/>
     <w:tmpl w:val="B7F47FF0"/>
@@ -7828,85 +9005,109 @@
     </w:lvl>
   </w:abstractNum>
   <w:num w:numId="1" w16cid:durableId="869879086">
-    <w:abstractNumId w:val="25"/>
+    <w:abstractNumId w:val="33"/>
   </w:num>
   <w:num w:numId="2" w16cid:durableId="1249850111">
-    <w:abstractNumId w:val="16"/>
+    <w:abstractNumId w:val="24"/>
   </w:num>
   <w:num w:numId="3" w16cid:durableId="670372396">
-    <w:abstractNumId w:val="21"/>
+    <w:abstractNumId w:val="29"/>
   </w:num>
   <w:num w:numId="4" w16cid:durableId="1707948019">
-    <w:abstractNumId w:val="6"/>
+    <w:abstractNumId w:val="9"/>
   </w:num>
   <w:num w:numId="5" w16cid:durableId="1039167186">
-    <w:abstractNumId w:val="17"/>
+    <w:abstractNumId w:val="25"/>
   </w:num>
   <w:num w:numId="6" w16cid:durableId="800734105">
     <w:abstractNumId w:val="3"/>
   </w:num>
   <w:num w:numId="7" w16cid:durableId="2092116003">
-    <w:abstractNumId w:val="18"/>
+    <w:abstractNumId w:val="26"/>
   </w:num>
   <w:num w:numId="8" w16cid:durableId="2031684309">
+    <w:abstractNumId w:val="28"/>
+  </w:num>
+  <w:num w:numId="9" w16cid:durableId="342709450">
     <w:abstractNumId w:val="20"/>
   </w:num>
-  <w:num w:numId="9" w16cid:durableId="342709450">
-    <w:abstractNumId w:val="12"/>
+  <w:num w:numId="10" w16cid:durableId="938638410">
+    <w:abstractNumId w:val="19"/>
   </w:num>
-  <w:num w:numId="10" w16cid:durableId="938638410">
+  <w:num w:numId="11" w16cid:durableId="1601840524">
     <w:abstractNumId w:val="11"/>
   </w:num>
-  <w:num w:numId="11" w16cid:durableId="1601840524">
-    <w:abstractNumId w:val="8"/>
-  </w:num>
   <w:num w:numId="12" w16cid:durableId="1708329718">
-    <w:abstractNumId w:val="15"/>
+    <w:abstractNumId w:val="23"/>
   </w:num>
   <w:num w:numId="13" w16cid:durableId="1383558028">
-    <w:abstractNumId w:val="7"/>
+    <w:abstractNumId w:val="10"/>
   </w:num>
   <w:num w:numId="14" w16cid:durableId="393356350">
-    <w:abstractNumId w:val="9"/>
+    <w:abstractNumId w:val="13"/>
   </w:num>
   <w:num w:numId="15" w16cid:durableId="1528061983">
-    <w:abstractNumId w:val="5"/>
+    <w:abstractNumId w:val="8"/>
   </w:num>
   <w:num w:numId="16" w16cid:durableId="2114471859">
     <w:abstractNumId w:val="2"/>
   </w:num>
   <w:num w:numId="17" w16cid:durableId="1791624147">
-    <w:abstractNumId w:val="19"/>
+    <w:abstractNumId w:val="27"/>
   </w:num>
   <w:num w:numId="18" w16cid:durableId="244388283">
-    <w:abstractNumId w:val="23"/>
+    <w:abstractNumId w:val="31"/>
   </w:num>
   <w:num w:numId="19" w16cid:durableId="714696166">
-    <w:abstractNumId w:val="24"/>
+    <w:abstractNumId w:val="32"/>
   </w:num>
   <w:num w:numId="20" w16cid:durableId="646517153">
-    <w:abstractNumId w:val="4"/>
+    <w:abstractNumId w:val="5"/>
   </w:num>
   <w:num w:numId="21" w16cid:durableId="325480431">
-    <w:abstractNumId w:val="22"/>
+    <w:abstractNumId w:val="30"/>
   </w:num>
   <w:num w:numId="22" w16cid:durableId="1543442656">
-    <w:abstractNumId w:val="26"/>
+    <w:abstractNumId w:val="34"/>
   </w:num>
   <w:num w:numId="23" w16cid:durableId="864565552">
     <w:abstractNumId w:val="0"/>
   </w:num>
   <w:num w:numId="24" w16cid:durableId="1605915925">
-    <w:abstractNumId w:val="13"/>
+    <w:abstractNumId w:val="21"/>
   </w:num>
   <w:num w:numId="25" w16cid:durableId="1741947087">
-    <w:abstractNumId w:val="14"/>
+    <w:abstractNumId w:val="22"/>
   </w:num>
   <w:num w:numId="26" w16cid:durableId="119962395">
-    <w:abstractNumId w:val="10"/>
+    <w:abstractNumId w:val="14"/>
   </w:num>
   <w:num w:numId="27" w16cid:durableId="1679425564">
     <w:abstractNumId w:val="1"/>
+  </w:num>
+  <w:num w:numId="28" w16cid:durableId="512691233">
+    <w:abstractNumId w:val="6"/>
+  </w:num>
+  <w:num w:numId="29" w16cid:durableId="267276856">
+    <w:abstractNumId w:val="4"/>
+  </w:num>
+  <w:num w:numId="30" w16cid:durableId="882448917">
+    <w:abstractNumId w:val="12"/>
+  </w:num>
+  <w:num w:numId="31" w16cid:durableId="157893186">
+    <w:abstractNumId w:val="17"/>
+  </w:num>
+  <w:num w:numId="32" w16cid:durableId="1455364895">
+    <w:abstractNumId w:val="15"/>
+  </w:num>
+  <w:num w:numId="33" w16cid:durableId="1402411073">
+    <w:abstractNumId w:val="16"/>
+  </w:num>
+  <w:num w:numId="34" w16cid:durableId="89620343">
+    <w:abstractNumId w:val="7"/>
+  </w:num>
+  <w:num w:numId="35" w16cid:durableId="101069661">
+    <w:abstractNumId w:val="18"/>
   </w:num>
 </w:numbering>
 </file>
@@ -8890,6 +10091,24 @@
       </w:tblBorders>
     </w:tblPr>
   </w:style>
+  <w:style w:type="paragraph" w:styleId="NormaleWeb">
+    <w:name w:val="Normal (Web)"/>
+    <w:basedOn w:val="Normale"/>
+    <w:uiPriority w:val="99"/>
+    <w:unhideWhenUsed/>
+    <w:rsid w:val="002F6582"/>
+    <w:pPr>
+      <w:spacing w:before="100" w:beforeAutospacing="1" w:after="100" w:afterAutospacing="1" w:line="240" w:lineRule="auto"/>
+    </w:pPr>
+    <w:rPr>
+      <w:rFonts w:ascii="Times New Roman" w:eastAsia="Times New Roman" w:hAnsi="Times New Roman" w:cs="Times New Roman"/>
+      <w:kern w:val="0"/>
+      <w:sz w:val="24"/>
+      <w:szCs w:val="24"/>
+      <w:lang w:eastAsia="it-IT"/>
+      <w14:ligatures w14:val="none"/>
+    </w:rPr>
+  </w:style>
 </w:styles>
 </file>
 

</xml_diff>